<commit_message>
add results from local repository
</commit_message>
<xml_diff>
--- a/output/E_value_stent.docx
+++ b/output/E_value_stent.docx
@@ -17,7 +17,7 @@
         <w:tblLook w:firstRow="1" w:lastRow="0" w:firstColumn="0" w:lastColumn="0" w:noHBand="0" w:noVBand="1"/>
       </w:tblPr>
       <w:tblGrid>
-        <w:gridCol w:w="2184"/>
+        <w:gridCol w:w="2012"/>
         <w:gridCol w:w="839"/>
         <w:gridCol w:w="1389"/>
         <w:gridCol w:w="1805"/>
@@ -1706,7 +1706,7 @@
       </w:tr>
       <w:tr>
         <w:trPr>
-          <w:trHeight w:val="574" w:hRule="auto"/>
+          <w:trHeight w:val="617" w:hRule="auto"/>
         </w:trPr>
         <w:tc>
           <w:tcPr>
@@ -1759,507 +1759,227 @@
                 <w:szCs w:val="22"/>
                 <w:color w:val="000000"/>
               </w:rPr>
-              <w:t xml:space="preserve">REC011</w:t>
-            </w:r>
-          </w:p>
-        </w:tc>
-        <w:tc>
-          <w:tcPr>
-            <w:tcBorders>
-              <w:bottom w:val="none" w:sz="0" w:space="0" w:color="000000"/>
-              <w:top w:val="none" w:sz="0" w:space="0" w:color="000000"/>
-              <w:left w:val="none" w:sz="0" w:space="0" w:color="000000"/>
-              <w:right w:val="none" w:sz="0" w:space="0" w:color="000000"/>
-            </w:tcBorders>
-            <w:shd w:val="clear" w:color="auto" w:fill="FFFFFF"/>
-            <w:tcMar>
-              <w:top w:w="0" w:type="dxa"/>
-              <w:bottom w:w="0" w:type="dxa"/>
-              <w:left w:w="0" w:type="dxa"/>
-              <w:right w:w="0" w:type="dxa"/>
-            </w:tcMar>
-            <w:vAlign w:val="center"/>
-          </w:tcPr>
-          <w:p>
-            <w:pPr>
-              <w:pStyle w:val="Normal"/>
-              <w:jc w:val="center"/>
-              <w:pBdr>
-                <w:bottom w:val="none" w:sz="0" w:space="0" w:color="000000"/>
-                <w:top w:val="none" w:sz="0" w:space="0" w:color="000000"/>
-                <w:left w:val="none" w:sz="0" w:space="0" w:color="000000"/>
-                <w:right w:val="none" w:sz="0" w:space="0" w:color="000000"/>
-              </w:pBdr>
-              <w:spacing w:after="100" w:before="100" w:line="240"/>
-              <w:ind w:left="100" w:right="100" w:firstLine="0" w:firstLineChars="0"/>
-              <w:rPr>
-                <w:rFonts w:ascii="Arial" w:hAnsi="Arial" w:eastAsia="Arial" w:cs="Arial"/>
-                <w:i w:val="false"/>
-                <w:b w:val="false"/>
-                <w:u w:val="none"/>
-                <w:strike w:val="false"/>
-                <w:sz w:val="22"/>
-                <w:szCs w:val="22"/>
-                <w:color w:val="000000"/>
-              </w:rPr>
-            </w:pPr>
-            <w:r>
-              <w:rPr>
-                <w:rFonts w:ascii="Arial" w:hAnsi="Arial" w:eastAsia="Arial" w:cs="Arial"/>
-                <w:i w:val="false"/>
-                <w:b w:val="false"/>
-                <w:u w:val="none"/>
-                <w:strike w:val="false"/>
-                <w:sz w:val="22"/>
-                <w:szCs w:val="22"/>
-                <w:color w:val="000000"/>
-              </w:rPr>
-              <w:t xml:space="preserve">0.57</w:t>
-            </w:r>
-          </w:p>
-        </w:tc>
-        <w:tc>
-          <w:tcPr>
-            <w:tcBorders>
-              <w:bottom w:val="none" w:sz="0" w:space="0" w:color="000000"/>
-              <w:top w:val="none" w:sz="0" w:space="0" w:color="000000"/>
-              <w:left w:val="none" w:sz="0" w:space="0" w:color="000000"/>
-              <w:right w:val="none" w:sz="0" w:space="0" w:color="000000"/>
-            </w:tcBorders>
-            <w:shd w:val="clear" w:color="auto" w:fill="FFFFFF"/>
-            <w:tcMar>
-              <w:top w:w="0" w:type="dxa"/>
-              <w:bottom w:w="0" w:type="dxa"/>
-              <w:left w:w="0" w:type="dxa"/>
-              <w:right w:w="0" w:type="dxa"/>
-            </w:tcMar>
-            <w:vAlign w:val="center"/>
-          </w:tcPr>
-          <w:p>
-            <w:pPr>
-              <w:pStyle w:val="Normal"/>
-              <w:jc w:val="center"/>
-              <w:pBdr>
-                <w:bottom w:val="none" w:sz="0" w:space="0" w:color="000000"/>
-                <w:top w:val="none" w:sz="0" w:space="0" w:color="000000"/>
-                <w:left w:val="none" w:sz="0" w:space="0" w:color="000000"/>
-                <w:right w:val="none" w:sz="0" w:space="0" w:color="000000"/>
-              </w:pBdr>
-              <w:spacing w:after="100" w:before="100" w:line="240"/>
-              <w:ind w:left="100" w:right="100" w:firstLine="0" w:firstLineChars="0"/>
-              <w:rPr>
-                <w:rFonts w:ascii="Arial" w:hAnsi="Arial" w:eastAsia="Arial" w:cs="Arial"/>
-                <w:i w:val="false"/>
-                <w:b w:val="false"/>
-                <w:u w:val="none"/>
-                <w:strike w:val="false"/>
-                <w:sz w:val="22"/>
-                <w:szCs w:val="22"/>
-                <w:color w:val="000000"/>
-              </w:rPr>
-            </w:pPr>
-            <w:r>
-              <w:rPr>
-                <w:rFonts w:ascii="Arial" w:hAnsi="Arial" w:eastAsia="Arial" w:cs="Arial"/>
-                <w:i w:val="false"/>
-                <w:b w:val="false"/>
-                <w:u w:val="none"/>
-                <w:strike w:val="false"/>
-                <w:sz w:val="22"/>
-                <w:szCs w:val="22"/>
-                <w:color w:val="000000"/>
-              </w:rPr>
-              <w:t xml:space="preserve">0.39–0.81</w:t>
-            </w:r>
-          </w:p>
-        </w:tc>
-        <w:tc>
-          <w:tcPr>
-            <w:tcBorders>
-              <w:bottom w:val="none" w:sz="0" w:space="0" w:color="000000"/>
-              <w:top w:val="none" w:sz="0" w:space="0" w:color="000000"/>
-              <w:left w:val="none" w:sz="0" w:space="0" w:color="000000"/>
-              <w:right w:val="none" w:sz="0" w:space="0" w:color="000000"/>
-            </w:tcBorders>
-            <w:shd w:val="clear" w:color="auto" w:fill="FFFFFF"/>
-            <w:tcMar>
-              <w:top w:w="0" w:type="dxa"/>
-              <w:bottom w:w="0" w:type="dxa"/>
-              <w:left w:w="0" w:type="dxa"/>
-              <w:right w:w="0" w:type="dxa"/>
-            </w:tcMar>
-            <w:vAlign w:val="center"/>
-          </w:tcPr>
-          <w:p>
-            <w:pPr>
-              <w:pStyle w:val="Normal"/>
-              <w:jc w:val="center"/>
-              <w:pBdr>
-                <w:bottom w:val="none" w:sz="0" w:space="0" w:color="000000"/>
-                <w:top w:val="none" w:sz="0" w:space="0" w:color="000000"/>
-                <w:left w:val="none" w:sz="0" w:space="0" w:color="000000"/>
-                <w:right w:val="none" w:sz="0" w:space="0" w:color="000000"/>
-              </w:pBdr>
-              <w:spacing w:after="100" w:before="100" w:line="240"/>
-              <w:ind w:left="100" w:right="100" w:firstLine="0" w:firstLineChars="0"/>
-              <w:rPr>
-                <w:rFonts w:ascii="Arial" w:hAnsi="Arial" w:eastAsia="Arial" w:cs="Arial"/>
-                <w:i w:val="false"/>
-                <w:b w:val="false"/>
-                <w:u w:val="none"/>
-                <w:strike w:val="false"/>
-                <w:sz w:val="22"/>
-                <w:szCs w:val="22"/>
-                <w:color w:val="000000"/>
-              </w:rPr>
-            </w:pPr>
-            <w:r>
-              <w:rPr>
-                <w:rFonts w:ascii="Arial" w:hAnsi="Arial" w:eastAsia="Arial" w:cs="Arial"/>
-                <w:i w:val="false"/>
-                <w:b w:val="false"/>
-                <w:u w:val="none"/>
-                <w:strike w:val="false"/>
-                <w:sz w:val="22"/>
-                <w:szCs w:val="22"/>
-                <w:color w:val="000000"/>
-              </w:rPr>
-              <w:t xml:space="preserve">2.90</w:t>
-            </w:r>
-          </w:p>
-        </w:tc>
-        <w:tc>
-          <w:tcPr>
-            <w:tcBorders>
-              <w:bottom w:val="none" w:sz="0" w:space="0" w:color="000000"/>
-              <w:top w:val="none" w:sz="0" w:space="0" w:color="000000"/>
-              <w:left w:val="none" w:sz="0" w:space="0" w:color="000000"/>
-              <w:right w:val="none" w:sz="0" w:space="0" w:color="000000"/>
-            </w:tcBorders>
-            <w:shd w:val="clear" w:color="auto" w:fill="FFFFFF"/>
-            <w:tcMar>
-              <w:top w:w="0" w:type="dxa"/>
-              <w:bottom w:w="0" w:type="dxa"/>
-              <w:left w:w="0" w:type="dxa"/>
-              <w:right w:w="0" w:type="dxa"/>
-            </w:tcMar>
-            <w:vAlign w:val="center"/>
-          </w:tcPr>
-          <w:p>
-            <w:pPr>
-              <w:pStyle w:val="Normal"/>
-              <w:jc w:val="center"/>
-              <w:pBdr>
-                <w:bottom w:val="none" w:sz="0" w:space="0" w:color="000000"/>
-                <w:top w:val="none" w:sz="0" w:space="0" w:color="000000"/>
-                <w:left w:val="none" w:sz="0" w:space="0" w:color="000000"/>
-                <w:right w:val="none" w:sz="0" w:space="0" w:color="000000"/>
-              </w:pBdr>
-              <w:spacing w:after="100" w:before="100" w:line="240"/>
-              <w:ind w:left="100" w:right="100" w:firstLine="0" w:firstLineChars="0"/>
-              <w:rPr>
-                <w:rFonts w:ascii="Arial" w:hAnsi="Arial" w:eastAsia="Arial" w:cs="Arial"/>
-                <w:i w:val="false"/>
-                <w:b w:val="false"/>
-                <w:u w:val="none"/>
-                <w:strike w:val="false"/>
-                <w:sz w:val="22"/>
-                <w:szCs w:val="22"/>
-                <w:color w:val="000000"/>
-              </w:rPr>
-            </w:pPr>
-            <w:r>
-              <w:rPr>
-                <w:rFonts w:ascii="Arial" w:hAnsi="Arial" w:eastAsia="Arial" w:cs="Arial"/>
-                <w:i w:val="false"/>
-                <w:b w:val="false"/>
-                <w:u w:val="none"/>
-                <w:strike w:val="false"/>
-                <w:sz w:val="22"/>
-                <w:szCs w:val="22"/>
-                <w:color w:val="000000"/>
-              </w:rPr>
-              <w:t xml:space="preserve">1.77</w:t>
-            </w:r>
-          </w:p>
-        </w:tc>
-      </w:tr>
-      <w:tr>
-        <w:trPr>
-          <w:trHeight w:val="615" w:hRule="auto"/>
-        </w:trPr>
-        <w:tc>
-          <w:tcPr>
-            <w:tcBorders>
-              <w:bottom w:val="none" w:sz="0" w:space="0" w:color="000000"/>
-              <w:top w:val="none" w:sz="0" w:space="0" w:color="000000"/>
-              <w:left w:val="none" w:sz="0" w:space="0" w:color="000000"/>
-              <w:right w:val="none" w:sz="0" w:space="0" w:color="000000"/>
-            </w:tcBorders>
-            <w:shd w:val="clear" w:color="auto" w:fill="FFFFFF"/>
-            <w:tcMar>
-              <w:top w:w="0" w:type="dxa"/>
-              <w:bottom w:w="0" w:type="dxa"/>
-              <w:left w:w="0" w:type="dxa"/>
-              <w:right w:w="0" w:type="dxa"/>
-            </w:tcMar>
-            <w:vAlign w:val="center"/>
-          </w:tcPr>
-          <w:p>
-            <w:pPr>
-              <w:pStyle w:val="Normal"/>
-              <w:jc w:val="left"/>
-              <w:pBdr>
-                <w:bottom w:val="none" w:sz="0" w:space="0" w:color="000000"/>
-                <w:top w:val="none" w:sz="0" w:space="0" w:color="000000"/>
-                <w:left w:val="none" w:sz="0" w:space="0" w:color="000000"/>
-                <w:right w:val="none" w:sz="0" w:space="0" w:color="000000"/>
-              </w:pBdr>
-              <w:spacing w:after="100" w:before="100" w:line="240"/>
-              <w:ind w:left="100" w:right="100" w:firstLine="0" w:firstLineChars="0"/>
-              <w:rPr>
-                <w:rFonts w:ascii="Arial" w:hAnsi="Arial" w:eastAsia="Arial" w:cs="Arial"/>
-                <w:i w:val="false"/>
-                <w:b w:val="false"/>
-                <w:u w:val="none"/>
-                <w:strike w:val="false"/>
-                <w:sz w:val="22"/>
-                <w:szCs w:val="22"/>
-                <w:color w:val="000000"/>
-              </w:rPr>
-            </w:pPr>
-            <w:r>
-              <w:rPr>
-                <w:rFonts w:ascii="Arial" w:hAnsi="Arial" w:eastAsia="Arial" w:cs="Arial"/>
-                <w:i w:val="false"/>
-                <w:b w:val="false"/>
-                <w:u w:val="none"/>
-                <w:strike w:val="false"/>
-                <w:sz w:val="22"/>
-                <w:szCs w:val="22"/>
-                <w:color w:val="000000"/>
-              </w:rPr>
-              <w:t xml:space="preserve">REC011_best</w:t>
-            </w:r>
-          </w:p>
-        </w:tc>
-        <w:tc>
-          <w:tcPr>
-            <w:tcBorders>
-              <w:bottom w:val="none" w:sz="0" w:space="0" w:color="000000"/>
-              <w:top w:val="none" w:sz="0" w:space="0" w:color="000000"/>
-              <w:left w:val="none" w:sz="0" w:space="0" w:color="000000"/>
-              <w:right w:val="none" w:sz="0" w:space="0" w:color="000000"/>
-            </w:tcBorders>
-            <w:shd w:val="clear" w:color="auto" w:fill="FFFFFF"/>
-            <w:tcMar>
-              <w:top w:w="0" w:type="dxa"/>
-              <w:bottom w:w="0" w:type="dxa"/>
-              <w:left w:w="0" w:type="dxa"/>
-              <w:right w:w="0" w:type="dxa"/>
-            </w:tcMar>
-            <w:vAlign w:val="center"/>
-          </w:tcPr>
-          <w:p>
-            <w:pPr>
-              <w:pStyle w:val="Normal"/>
-              <w:jc w:val="center"/>
-              <w:pBdr>
-                <w:bottom w:val="none" w:sz="0" w:space="0" w:color="000000"/>
-                <w:top w:val="none" w:sz="0" w:space="0" w:color="000000"/>
-                <w:left w:val="none" w:sz="0" w:space="0" w:color="000000"/>
-                <w:right w:val="none" w:sz="0" w:space="0" w:color="000000"/>
-              </w:pBdr>
-              <w:spacing w:after="100" w:before="100" w:line="240"/>
-              <w:ind w:left="100" w:right="100" w:firstLine="0" w:firstLineChars="0"/>
-              <w:rPr>
-                <w:rFonts w:ascii="Arial" w:hAnsi="Arial" w:eastAsia="Arial" w:cs="Arial"/>
-                <w:i w:val="false"/>
-                <w:b w:val="false"/>
-                <w:u w:val="none"/>
-                <w:strike w:val="false"/>
-                <w:sz w:val="22"/>
-                <w:szCs w:val="22"/>
-                <w:color w:val="000000"/>
-              </w:rPr>
-            </w:pPr>
-            <w:r>
-              <w:rPr>
-                <w:rFonts w:ascii="Arial" w:hAnsi="Arial" w:eastAsia="Arial" w:cs="Arial"/>
-                <w:i w:val="false"/>
-                <w:b w:val="false"/>
-                <w:u w:val="none"/>
-                <w:strike w:val="false"/>
-                <w:sz w:val="22"/>
-                <w:szCs w:val="22"/>
-                <w:color w:val="000000"/>
-              </w:rPr>
-              <w:t xml:space="preserve">0.50</w:t>
-            </w:r>
-          </w:p>
-        </w:tc>
-        <w:tc>
-          <w:tcPr>
-            <w:tcBorders>
-              <w:bottom w:val="none" w:sz="0" w:space="0" w:color="000000"/>
-              <w:top w:val="none" w:sz="0" w:space="0" w:color="000000"/>
-              <w:left w:val="none" w:sz="0" w:space="0" w:color="000000"/>
-              <w:right w:val="none" w:sz="0" w:space="0" w:color="000000"/>
-            </w:tcBorders>
-            <w:shd w:val="clear" w:color="auto" w:fill="FFFFFF"/>
-            <w:tcMar>
-              <w:top w:w="0" w:type="dxa"/>
-              <w:bottom w:w="0" w:type="dxa"/>
-              <w:left w:w="0" w:type="dxa"/>
-              <w:right w:w="0" w:type="dxa"/>
-            </w:tcMar>
-            <w:vAlign w:val="center"/>
-          </w:tcPr>
-          <w:p>
-            <w:pPr>
-              <w:pStyle w:val="Normal"/>
-              <w:jc w:val="center"/>
-              <w:pBdr>
-                <w:bottom w:val="none" w:sz="0" w:space="0" w:color="000000"/>
-                <w:top w:val="none" w:sz="0" w:space="0" w:color="000000"/>
-                <w:left w:val="none" w:sz="0" w:space="0" w:color="000000"/>
-                <w:right w:val="none" w:sz="0" w:space="0" w:color="000000"/>
-              </w:pBdr>
-              <w:spacing w:after="100" w:before="100" w:line="240"/>
-              <w:ind w:left="100" w:right="100" w:firstLine="0" w:firstLineChars="0"/>
-              <w:rPr>
-                <w:rFonts w:ascii="Arial" w:hAnsi="Arial" w:eastAsia="Arial" w:cs="Arial"/>
-                <w:i w:val="false"/>
-                <w:b w:val="false"/>
-                <w:u w:val="none"/>
-                <w:strike w:val="false"/>
-                <w:sz w:val="22"/>
-                <w:szCs w:val="22"/>
-                <w:color w:val="000000"/>
-              </w:rPr>
-            </w:pPr>
-            <w:r>
-              <w:rPr>
-                <w:rFonts w:ascii="Arial" w:hAnsi="Arial" w:eastAsia="Arial" w:cs="Arial"/>
-                <w:i w:val="false"/>
-                <w:b w:val="false"/>
-                <w:u w:val="none"/>
-                <w:strike w:val="false"/>
-                <w:sz w:val="22"/>
-                <w:szCs w:val="22"/>
-                <w:color w:val="000000"/>
-              </w:rPr>
-              <w:t xml:space="preserve">0.33–0.74</w:t>
-            </w:r>
-          </w:p>
-        </w:tc>
-        <w:tc>
-          <w:tcPr>
-            <w:tcBorders>
-              <w:bottom w:val="none" w:sz="0" w:space="0" w:color="000000"/>
-              <w:top w:val="none" w:sz="0" w:space="0" w:color="000000"/>
-              <w:left w:val="none" w:sz="0" w:space="0" w:color="000000"/>
-              <w:right w:val="none" w:sz="0" w:space="0" w:color="000000"/>
-            </w:tcBorders>
-            <w:shd w:val="clear" w:color="auto" w:fill="FFFFFF"/>
-            <w:tcMar>
-              <w:top w:w="0" w:type="dxa"/>
-              <w:bottom w:w="0" w:type="dxa"/>
-              <w:left w:w="0" w:type="dxa"/>
-              <w:right w:w="0" w:type="dxa"/>
-            </w:tcMar>
-            <w:vAlign w:val="center"/>
-          </w:tcPr>
-          <w:p>
-            <w:pPr>
-              <w:pStyle w:val="Normal"/>
-              <w:jc w:val="center"/>
-              <w:pBdr>
-                <w:bottom w:val="none" w:sz="0" w:space="0" w:color="000000"/>
-                <w:top w:val="none" w:sz="0" w:space="0" w:color="000000"/>
-                <w:left w:val="none" w:sz="0" w:space="0" w:color="000000"/>
-                <w:right w:val="none" w:sz="0" w:space="0" w:color="000000"/>
-              </w:pBdr>
-              <w:spacing w:after="100" w:before="100" w:line="240"/>
-              <w:ind w:left="100" w:right="100" w:firstLine="0" w:firstLineChars="0"/>
-              <w:rPr>
-                <w:rFonts w:ascii="Arial" w:hAnsi="Arial" w:eastAsia="Arial" w:cs="Arial"/>
-                <w:i w:val="false"/>
-                <w:b w:val="false"/>
-                <w:u w:val="none"/>
-                <w:strike w:val="false"/>
-                <w:sz w:val="22"/>
-                <w:szCs w:val="22"/>
-                <w:color w:val="000000"/>
-              </w:rPr>
-            </w:pPr>
-            <w:r>
-              <w:rPr>
-                <w:rFonts w:ascii="Arial" w:hAnsi="Arial" w:eastAsia="Arial" w:cs="Arial"/>
-                <w:i w:val="false"/>
-                <w:b w:val="false"/>
-                <w:u w:val="none"/>
-                <w:strike w:val="false"/>
-                <w:sz w:val="22"/>
-                <w:szCs w:val="22"/>
-                <w:color w:val="000000"/>
-              </w:rPr>
-              <w:t xml:space="preserve">3.41</w:t>
-            </w:r>
-          </w:p>
-        </w:tc>
-        <w:tc>
-          <w:tcPr>
-            <w:tcBorders>
-              <w:bottom w:val="none" w:sz="0" w:space="0" w:color="000000"/>
-              <w:top w:val="none" w:sz="0" w:space="0" w:color="000000"/>
-              <w:left w:val="none" w:sz="0" w:space="0" w:color="000000"/>
-              <w:right w:val="none" w:sz="0" w:space="0" w:color="000000"/>
-            </w:tcBorders>
-            <w:shd w:val="clear" w:color="auto" w:fill="FFFFFF"/>
-            <w:tcMar>
-              <w:top w:w="0" w:type="dxa"/>
-              <w:bottom w:w="0" w:type="dxa"/>
-              <w:left w:w="0" w:type="dxa"/>
-              <w:right w:w="0" w:type="dxa"/>
-            </w:tcMar>
-            <w:vAlign w:val="center"/>
-          </w:tcPr>
-          <w:p>
-            <w:pPr>
-              <w:pStyle w:val="Normal"/>
-              <w:jc w:val="center"/>
-              <w:pBdr>
-                <w:bottom w:val="none" w:sz="0" w:space="0" w:color="000000"/>
-                <w:top w:val="none" w:sz="0" w:space="0" w:color="000000"/>
-                <w:left w:val="none" w:sz="0" w:space="0" w:color="000000"/>
-                <w:right w:val="none" w:sz="0" w:space="0" w:color="000000"/>
-              </w:pBdr>
-              <w:spacing w:after="100" w:before="100" w:line="240"/>
-              <w:ind w:left="100" w:right="100" w:firstLine="0" w:firstLineChars="0"/>
-              <w:rPr>
-                <w:rFonts w:ascii="Arial" w:hAnsi="Arial" w:eastAsia="Arial" w:cs="Arial"/>
-                <w:i w:val="false"/>
-                <w:b w:val="false"/>
-                <w:u w:val="none"/>
-                <w:strike w:val="false"/>
-                <w:sz w:val="22"/>
-                <w:szCs w:val="22"/>
-                <w:color w:val="000000"/>
-              </w:rPr>
-            </w:pPr>
-            <w:r>
-              <w:rPr>
-                <w:rFonts w:ascii="Arial" w:hAnsi="Arial" w:eastAsia="Arial" w:cs="Arial"/>
-                <w:i w:val="false"/>
-                <w:b w:val="false"/>
-                <w:u w:val="none"/>
-                <w:strike w:val="false"/>
-                <w:sz w:val="22"/>
-                <w:szCs w:val="22"/>
-                <w:color w:val="000000"/>
-              </w:rPr>
-              <w:t xml:space="preserve">2.04</w:t>
+              <w:t xml:space="preserve">OBSTadj</w:t>
+            </w:r>
+          </w:p>
+        </w:tc>
+        <w:tc>
+          <w:tcPr>
+            <w:tcBorders>
+              <w:bottom w:val="none" w:sz="0" w:space="0" w:color="000000"/>
+              <w:top w:val="none" w:sz="0" w:space="0" w:color="000000"/>
+              <w:left w:val="none" w:sz="0" w:space="0" w:color="000000"/>
+              <w:right w:val="none" w:sz="0" w:space="0" w:color="000000"/>
+            </w:tcBorders>
+            <w:shd w:val="clear" w:color="auto" w:fill="FFFFFF"/>
+            <w:tcMar>
+              <w:top w:w="0" w:type="dxa"/>
+              <w:bottom w:w="0" w:type="dxa"/>
+              <w:left w:w="0" w:type="dxa"/>
+              <w:right w:w="0" w:type="dxa"/>
+            </w:tcMar>
+            <w:vAlign w:val="center"/>
+          </w:tcPr>
+          <w:p>
+            <w:pPr>
+              <w:pStyle w:val="Normal"/>
+              <w:jc w:val="center"/>
+              <w:pBdr>
+                <w:bottom w:val="none" w:sz="0" w:space="0" w:color="000000"/>
+                <w:top w:val="none" w:sz="0" w:space="0" w:color="000000"/>
+                <w:left w:val="none" w:sz="0" w:space="0" w:color="000000"/>
+                <w:right w:val="none" w:sz="0" w:space="0" w:color="000000"/>
+              </w:pBdr>
+              <w:spacing w:after="100" w:before="100" w:line="240"/>
+              <w:ind w:left="100" w:right="100" w:firstLine="0" w:firstLineChars="0"/>
+              <w:rPr>
+                <w:rFonts w:ascii="Arial" w:hAnsi="Arial" w:eastAsia="Arial" w:cs="Arial"/>
+                <w:i w:val="false"/>
+                <w:b w:val="false"/>
+                <w:u w:val="none"/>
+                <w:strike w:val="false"/>
+                <w:sz w:val="22"/>
+                <w:szCs w:val="22"/>
+                <w:color w:val="000000"/>
+              </w:rPr>
+            </w:pPr>
+            <w:r>
+              <w:rPr>
+                <w:rFonts w:ascii="Arial" w:hAnsi="Arial" w:eastAsia="Arial" w:cs="Arial"/>
+                <w:i w:val="false"/>
+                <w:b w:val="false"/>
+                <w:u w:val="none"/>
+                <w:strike w:val="false"/>
+                <w:sz w:val="22"/>
+                <w:szCs w:val="22"/>
+                <w:color w:val="000000"/>
+              </w:rPr>
+              <w:t xml:space="preserve">3.71</w:t>
+            </w:r>
+          </w:p>
+        </w:tc>
+        <w:tc>
+          <w:tcPr>
+            <w:tcBorders>
+              <w:bottom w:val="none" w:sz="0" w:space="0" w:color="000000"/>
+              <w:top w:val="none" w:sz="0" w:space="0" w:color="000000"/>
+              <w:left w:val="none" w:sz="0" w:space="0" w:color="000000"/>
+              <w:right w:val="none" w:sz="0" w:space="0" w:color="000000"/>
+            </w:tcBorders>
+            <w:shd w:val="clear" w:color="auto" w:fill="FFFFFF"/>
+            <w:tcMar>
+              <w:top w:w="0" w:type="dxa"/>
+              <w:bottom w:w="0" w:type="dxa"/>
+              <w:left w:w="0" w:type="dxa"/>
+              <w:right w:w="0" w:type="dxa"/>
+            </w:tcMar>
+            <w:vAlign w:val="center"/>
+          </w:tcPr>
+          <w:p>
+            <w:pPr>
+              <w:pStyle w:val="Normal"/>
+              <w:jc w:val="center"/>
+              <w:pBdr>
+                <w:bottom w:val="none" w:sz="0" w:space="0" w:color="000000"/>
+                <w:top w:val="none" w:sz="0" w:space="0" w:color="000000"/>
+                <w:left w:val="none" w:sz="0" w:space="0" w:color="000000"/>
+                <w:right w:val="none" w:sz="0" w:space="0" w:color="000000"/>
+              </w:pBdr>
+              <w:spacing w:after="100" w:before="100" w:line="240"/>
+              <w:ind w:left="100" w:right="100" w:firstLine="0" w:firstLineChars="0"/>
+              <w:rPr>
+                <w:rFonts w:ascii="Arial" w:hAnsi="Arial" w:eastAsia="Arial" w:cs="Arial"/>
+                <w:i w:val="false"/>
+                <w:b w:val="false"/>
+                <w:u w:val="none"/>
+                <w:strike w:val="false"/>
+                <w:sz w:val="22"/>
+                <w:szCs w:val="22"/>
+                <w:color w:val="000000"/>
+              </w:rPr>
+            </w:pPr>
+            <w:r>
+              <w:rPr>
+                <w:rFonts w:ascii="Arial" w:hAnsi="Arial" w:eastAsia="Arial" w:cs="Arial"/>
+                <w:i w:val="false"/>
+                <w:b w:val="false"/>
+                <w:u w:val="none"/>
+                <w:strike w:val="false"/>
+                <w:sz w:val="22"/>
+                <w:szCs w:val="22"/>
+                <w:color w:val="000000"/>
+              </w:rPr>
+              <w:t xml:space="preserve">2.50–5.52</w:t>
+            </w:r>
+          </w:p>
+        </w:tc>
+        <w:tc>
+          <w:tcPr>
+            <w:tcBorders>
+              <w:bottom w:val="none" w:sz="0" w:space="0" w:color="000000"/>
+              <w:top w:val="none" w:sz="0" w:space="0" w:color="000000"/>
+              <w:left w:val="none" w:sz="0" w:space="0" w:color="000000"/>
+              <w:right w:val="none" w:sz="0" w:space="0" w:color="000000"/>
+            </w:tcBorders>
+            <w:shd w:val="clear" w:color="auto" w:fill="FFFFFF"/>
+            <w:tcMar>
+              <w:top w:w="0" w:type="dxa"/>
+              <w:bottom w:w="0" w:type="dxa"/>
+              <w:left w:w="0" w:type="dxa"/>
+              <w:right w:w="0" w:type="dxa"/>
+            </w:tcMar>
+            <w:vAlign w:val="center"/>
+          </w:tcPr>
+          <w:p>
+            <w:pPr>
+              <w:pStyle w:val="Normal"/>
+              <w:jc w:val="center"/>
+              <w:pBdr>
+                <w:bottom w:val="none" w:sz="0" w:space="0" w:color="000000"/>
+                <w:top w:val="none" w:sz="0" w:space="0" w:color="000000"/>
+                <w:left w:val="none" w:sz="0" w:space="0" w:color="000000"/>
+                <w:right w:val="none" w:sz="0" w:space="0" w:color="000000"/>
+              </w:pBdr>
+              <w:spacing w:after="100" w:before="100" w:line="240"/>
+              <w:ind w:left="100" w:right="100" w:firstLine="0" w:firstLineChars="0"/>
+              <w:rPr>
+                <w:rFonts w:ascii="Arial" w:hAnsi="Arial" w:eastAsia="Arial" w:cs="Arial"/>
+                <w:i w:val="false"/>
+                <w:b w:val="false"/>
+                <w:u w:val="none"/>
+                <w:strike w:val="false"/>
+                <w:sz w:val="22"/>
+                <w:szCs w:val="22"/>
+                <w:color w:val="000000"/>
+              </w:rPr>
+            </w:pPr>
+            <w:r>
+              <w:rPr>
+                <w:rFonts w:ascii="Arial" w:hAnsi="Arial" w:eastAsia="Arial" w:cs="Arial"/>
+                <w:i w:val="false"/>
+                <w:b w:val="false"/>
+                <w:u w:val="none"/>
+                <w:strike w:val="false"/>
+                <w:sz w:val="22"/>
+                <w:szCs w:val="22"/>
+                <w:color w:val="000000"/>
+              </w:rPr>
+              <w:t xml:space="preserve">6.88</w:t>
+            </w:r>
+          </w:p>
+        </w:tc>
+        <w:tc>
+          <w:tcPr>
+            <w:tcBorders>
+              <w:bottom w:val="none" w:sz="0" w:space="0" w:color="000000"/>
+              <w:top w:val="none" w:sz="0" w:space="0" w:color="000000"/>
+              <w:left w:val="none" w:sz="0" w:space="0" w:color="000000"/>
+              <w:right w:val="none" w:sz="0" w:space="0" w:color="000000"/>
+            </w:tcBorders>
+            <w:shd w:val="clear" w:color="auto" w:fill="FFFFFF"/>
+            <w:tcMar>
+              <w:top w:w="0" w:type="dxa"/>
+              <w:bottom w:w="0" w:type="dxa"/>
+              <w:left w:w="0" w:type="dxa"/>
+              <w:right w:w="0" w:type="dxa"/>
+            </w:tcMar>
+            <w:vAlign w:val="center"/>
+          </w:tcPr>
+          <w:p>
+            <w:pPr>
+              <w:pStyle w:val="Normal"/>
+              <w:jc w:val="center"/>
+              <w:pBdr>
+                <w:bottom w:val="none" w:sz="0" w:space="0" w:color="000000"/>
+                <w:top w:val="none" w:sz="0" w:space="0" w:color="000000"/>
+                <w:left w:val="none" w:sz="0" w:space="0" w:color="000000"/>
+                <w:right w:val="none" w:sz="0" w:space="0" w:color="000000"/>
+              </w:pBdr>
+              <w:spacing w:after="100" w:before="100" w:line="240"/>
+              <w:ind w:left="100" w:right="100" w:firstLine="0" w:firstLineChars="0"/>
+              <w:rPr>
+                <w:rFonts w:ascii="Arial" w:hAnsi="Arial" w:eastAsia="Arial" w:cs="Arial"/>
+                <w:i w:val="false"/>
+                <w:b w:val="false"/>
+                <w:u w:val="none"/>
+                <w:strike w:val="false"/>
+                <w:sz w:val="22"/>
+                <w:szCs w:val="22"/>
+                <w:color w:val="000000"/>
+              </w:rPr>
+            </w:pPr>
+            <w:r>
+              <w:rPr>
+                <w:rFonts w:ascii="Arial" w:hAnsi="Arial" w:eastAsia="Arial" w:cs="Arial"/>
+                <w:i w:val="false"/>
+                <w:b w:val="false"/>
+                <w:u w:val="none"/>
+                <w:strike w:val="false"/>
+                <w:sz w:val="22"/>
+                <w:szCs w:val="22"/>
+                <w:color w:val="000000"/>
+              </w:rPr>
+              <w:t xml:space="preserve">4.44</w:t>
             </w:r>
           </w:p>
         </w:tc>
@@ -2319,227 +2039,227 @@
                 <w:szCs w:val="22"/>
                 <w:color w:val="000000"/>
               </w:rPr>
-              <w:t xml:space="preserve">OBSTadj</w:t>
-            </w:r>
-          </w:p>
-        </w:tc>
-        <w:tc>
-          <w:tcPr>
-            <w:tcBorders>
-              <w:bottom w:val="none" w:sz="0" w:space="0" w:color="000000"/>
-              <w:top w:val="none" w:sz="0" w:space="0" w:color="000000"/>
-              <w:left w:val="none" w:sz="0" w:space="0" w:color="000000"/>
-              <w:right w:val="none" w:sz="0" w:space="0" w:color="000000"/>
-            </w:tcBorders>
-            <w:shd w:val="clear" w:color="auto" w:fill="FFFFFF"/>
-            <w:tcMar>
-              <w:top w:w="0" w:type="dxa"/>
-              <w:bottom w:w="0" w:type="dxa"/>
-              <w:left w:w="0" w:type="dxa"/>
-              <w:right w:w="0" w:type="dxa"/>
-            </w:tcMar>
-            <w:vAlign w:val="center"/>
-          </w:tcPr>
-          <w:p>
-            <w:pPr>
-              <w:pStyle w:val="Normal"/>
-              <w:jc w:val="center"/>
-              <w:pBdr>
-                <w:bottom w:val="none" w:sz="0" w:space="0" w:color="000000"/>
-                <w:top w:val="none" w:sz="0" w:space="0" w:color="000000"/>
-                <w:left w:val="none" w:sz="0" w:space="0" w:color="000000"/>
-                <w:right w:val="none" w:sz="0" w:space="0" w:color="000000"/>
-              </w:pBdr>
-              <w:spacing w:after="100" w:before="100" w:line="240"/>
-              <w:ind w:left="100" w:right="100" w:firstLine="0" w:firstLineChars="0"/>
-              <w:rPr>
-                <w:rFonts w:ascii="Arial" w:hAnsi="Arial" w:eastAsia="Arial" w:cs="Arial"/>
-                <w:i w:val="false"/>
-                <w:b w:val="false"/>
-                <w:u w:val="none"/>
-                <w:strike w:val="false"/>
-                <w:sz w:val="22"/>
-                <w:szCs w:val="22"/>
-                <w:color w:val="000000"/>
-              </w:rPr>
-            </w:pPr>
-            <w:r>
-              <w:rPr>
-                <w:rFonts w:ascii="Arial" w:hAnsi="Arial" w:eastAsia="Arial" w:cs="Arial"/>
-                <w:i w:val="false"/>
-                <w:b w:val="false"/>
-                <w:u w:val="none"/>
-                <w:strike w:val="false"/>
-                <w:sz w:val="22"/>
-                <w:szCs w:val="22"/>
-                <w:color w:val="000000"/>
-              </w:rPr>
-              <w:t xml:space="preserve">3.71</w:t>
-            </w:r>
-          </w:p>
-        </w:tc>
-        <w:tc>
-          <w:tcPr>
-            <w:tcBorders>
-              <w:bottom w:val="none" w:sz="0" w:space="0" w:color="000000"/>
-              <w:top w:val="none" w:sz="0" w:space="0" w:color="000000"/>
-              <w:left w:val="none" w:sz="0" w:space="0" w:color="000000"/>
-              <w:right w:val="none" w:sz="0" w:space="0" w:color="000000"/>
-            </w:tcBorders>
-            <w:shd w:val="clear" w:color="auto" w:fill="FFFFFF"/>
-            <w:tcMar>
-              <w:top w:w="0" w:type="dxa"/>
-              <w:bottom w:w="0" w:type="dxa"/>
-              <w:left w:w="0" w:type="dxa"/>
-              <w:right w:w="0" w:type="dxa"/>
-            </w:tcMar>
-            <w:vAlign w:val="center"/>
-          </w:tcPr>
-          <w:p>
-            <w:pPr>
-              <w:pStyle w:val="Normal"/>
-              <w:jc w:val="center"/>
-              <w:pBdr>
-                <w:bottom w:val="none" w:sz="0" w:space="0" w:color="000000"/>
-                <w:top w:val="none" w:sz="0" w:space="0" w:color="000000"/>
-                <w:left w:val="none" w:sz="0" w:space="0" w:color="000000"/>
-                <w:right w:val="none" w:sz="0" w:space="0" w:color="000000"/>
-              </w:pBdr>
-              <w:spacing w:after="100" w:before="100" w:line="240"/>
-              <w:ind w:left="100" w:right="100" w:firstLine="0" w:firstLineChars="0"/>
-              <w:rPr>
-                <w:rFonts w:ascii="Arial" w:hAnsi="Arial" w:eastAsia="Arial" w:cs="Arial"/>
-                <w:i w:val="false"/>
-                <w:b w:val="false"/>
-                <w:u w:val="none"/>
-                <w:strike w:val="false"/>
-                <w:sz w:val="22"/>
-                <w:szCs w:val="22"/>
-                <w:color w:val="000000"/>
-              </w:rPr>
-            </w:pPr>
-            <w:r>
-              <w:rPr>
-                <w:rFonts w:ascii="Arial" w:hAnsi="Arial" w:eastAsia="Arial" w:cs="Arial"/>
-                <w:i w:val="false"/>
-                <w:b w:val="false"/>
-                <w:u w:val="none"/>
-                <w:strike w:val="false"/>
-                <w:sz w:val="22"/>
-                <w:szCs w:val="22"/>
-                <w:color w:val="000000"/>
-              </w:rPr>
-              <w:t xml:space="preserve">2.50–5.52</w:t>
-            </w:r>
-          </w:p>
-        </w:tc>
-        <w:tc>
-          <w:tcPr>
-            <w:tcBorders>
-              <w:bottom w:val="none" w:sz="0" w:space="0" w:color="000000"/>
-              <w:top w:val="none" w:sz="0" w:space="0" w:color="000000"/>
-              <w:left w:val="none" w:sz="0" w:space="0" w:color="000000"/>
-              <w:right w:val="none" w:sz="0" w:space="0" w:color="000000"/>
-            </w:tcBorders>
-            <w:shd w:val="clear" w:color="auto" w:fill="FFFFFF"/>
-            <w:tcMar>
-              <w:top w:w="0" w:type="dxa"/>
-              <w:bottom w:w="0" w:type="dxa"/>
-              <w:left w:w="0" w:type="dxa"/>
-              <w:right w:w="0" w:type="dxa"/>
-            </w:tcMar>
-            <w:vAlign w:val="center"/>
-          </w:tcPr>
-          <w:p>
-            <w:pPr>
-              <w:pStyle w:val="Normal"/>
-              <w:jc w:val="center"/>
-              <w:pBdr>
-                <w:bottom w:val="none" w:sz="0" w:space="0" w:color="000000"/>
-                <w:top w:val="none" w:sz="0" w:space="0" w:color="000000"/>
-                <w:left w:val="none" w:sz="0" w:space="0" w:color="000000"/>
-                <w:right w:val="none" w:sz="0" w:space="0" w:color="000000"/>
-              </w:pBdr>
-              <w:spacing w:after="100" w:before="100" w:line="240"/>
-              <w:ind w:left="100" w:right="100" w:firstLine="0" w:firstLineChars="0"/>
-              <w:rPr>
-                <w:rFonts w:ascii="Arial" w:hAnsi="Arial" w:eastAsia="Arial" w:cs="Arial"/>
-                <w:i w:val="false"/>
-                <w:b w:val="false"/>
-                <w:u w:val="none"/>
-                <w:strike w:val="false"/>
-                <w:sz w:val="22"/>
-                <w:szCs w:val="22"/>
-                <w:color w:val="000000"/>
-              </w:rPr>
-            </w:pPr>
-            <w:r>
-              <w:rPr>
-                <w:rFonts w:ascii="Arial" w:hAnsi="Arial" w:eastAsia="Arial" w:cs="Arial"/>
-                <w:i w:val="false"/>
-                <w:b w:val="false"/>
-                <w:u w:val="none"/>
-                <w:strike w:val="false"/>
-                <w:sz w:val="22"/>
-                <w:szCs w:val="22"/>
-                <w:color w:val="000000"/>
-              </w:rPr>
-              <w:t xml:space="preserve">6.88</w:t>
-            </w:r>
-          </w:p>
-        </w:tc>
-        <w:tc>
-          <w:tcPr>
-            <w:tcBorders>
-              <w:bottom w:val="none" w:sz="0" w:space="0" w:color="000000"/>
-              <w:top w:val="none" w:sz="0" w:space="0" w:color="000000"/>
-              <w:left w:val="none" w:sz="0" w:space="0" w:color="000000"/>
-              <w:right w:val="none" w:sz="0" w:space="0" w:color="000000"/>
-            </w:tcBorders>
-            <w:shd w:val="clear" w:color="auto" w:fill="FFFFFF"/>
-            <w:tcMar>
-              <w:top w:w="0" w:type="dxa"/>
-              <w:bottom w:w="0" w:type="dxa"/>
-              <w:left w:w="0" w:type="dxa"/>
-              <w:right w:w="0" w:type="dxa"/>
-            </w:tcMar>
-            <w:vAlign w:val="center"/>
-          </w:tcPr>
-          <w:p>
-            <w:pPr>
-              <w:pStyle w:val="Normal"/>
-              <w:jc w:val="center"/>
-              <w:pBdr>
-                <w:bottom w:val="none" w:sz="0" w:space="0" w:color="000000"/>
-                <w:top w:val="none" w:sz="0" w:space="0" w:color="000000"/>
-                <w:left w:val="none" w:sz="0" w:space="0" w:color="000000"/>
-                <w:right w:val="none" w:sz="0" w:space="0" w:color="000000"/>
-              </w:pBdr>
-              <w:spacing w:after="100" w:before="100" w:line="240"/>
-              <w:ind w:left="100" w:right="100" w:firstLine="0" w:firstLineChars="0"/>
-              <w:rPr>
-                <w:rFonts w:ascii="Arial" w:hAnsi="Arial" w:eastAsia="Arial" w:cs="Arial"/>
-                <w:i w:val="false"/>
-                <w:b w:val="false"/>
-                <w:u w:val="none"/>
-                <w:strike w:val="false"/>
-                <w:sz w:val="22"/>
-                <w:szCs w:val="22"/>
-                <w:color w:val="000000"/>
-              </w:rPr>
-            </w:pPr>
-            <w:r>
-              <w:rPr>
-                <w:rFonts w:ascii="Arial" w:hAnsi="Arial" w:eastAsia="Arial" w:cs="Arial"/>
-                <w:i w:val="false"/>
-                <w:b w:val="false"/>
-                <w:u w:val="none"/>
-                <w:strike w:val="false"/>
-                <w:sz w:val="22"/>
-                <w:szCs w:val="22"/>
-                <w:color w:val="000000"/>
-              </w:rPr>
-              <w:t xml:space="preserve">4.44</w:t>
+              <w:t xml:space="preserve">URCOMPINJadj</w:t>
+            </w:r>
+          </w:p>
+        </w:tc>
+        <w:tc>
+          <w:tcPr>
+            <w:tcBorders>
+              <w:bottom w:val="none" w:sz="0" w:space="0" w:color="000000"/>
+              <w:top w:val="none" w:sz="0" w:space="0" w:color="000000"/>
+              <w:left w:val="none" w:sz="0" w:space="0" w:color="000000"/>
+              <w:right w:val="none" w:sz="0" w:space="0" w:color="000000"/>
+            </w:tcBorders>
+            <w:shd w:val="clear" w:color="auto" w:fill="FFFFFF"/>
+            <w:tcMar>
+              <w:top w:w="0" w:type="dxa"/>
+              <w:bottom w:w="0" w:type="dxa"/>
+              <w:left w:w="0" w:type="dxa"/>
+              <w:right w:w="0" w:type="dxa"/>
+            </w:tcMar>
+            <w:vAlign w:val="center"/>
+          </w:tcPr>
+          <w:p>
+            <w:pPr>
+              <w:pStyle w:val="Normal"/>
+              <w:jc w:val="center"/>
+              <w:pBdr>
+                <w:bottom w:val="none" w:sz="0" w:space="0" w:color="000000"/>
+                <w:top w:val="none" w:sz="0" w:space="0" w:color="000000"/>
+                <w:left w:val="none" w:sz="0" w:space="0" w:color="000000"/>
+                <w:right w:val="none" w:sz="0" w:space="0" w:color="000000"/>
+              </w:pBdr>
+              <w:spacing w:after="100" w:before="100" w:line="240"/>
+              <w:ind w:left="100" w:right="100" w:firstLine="0" w:firstLineChars="0"/>
+              <w:rPr>
+                <w:rFonts w:ascii="Arial" w:hAnsi="Arial" w:eastAsia="Arial" w:cs="Arial"/>
+                <w:i w:val="false"/>
+                <w:b w:val="false"/>
+                <w:u w:val="none"/>
+                <w:strike w:val="false"/>
+                <w:sz w:val="22"/>
+                <w:szCs w:val="22"/>
+                <w:color w:val="000000"/>
+              </w:rPr>
+            </w:pPr>
+            <w:r>
+              <w:rPr>
+                <w:rFonts w:ascii="Arial" w:hAnsi="Arial" w:eastAsia="Arial" w:cs="Arial"/>
+                <w:i w:val="false"/>
+                <w:b w:val="false"/>
+                <w:u w:val="none"/>
+                <w:strike w:val="false"/>
+                <w:sz w:val="22"/>
+                <w:szCs w:val="22"/>
+                <w:color w:val="000000"/>
+              </w:rPr>
+              <w:t xml:space="preserve">0.36</w:t>
+            </w:r>
+          </w:p>
+        </w:tc>
+        <w:tc>
+          <w:tcPr>
+            <w:tcBorders>
+              <w:bottom w:val="none" w:sz="0" w:space="0" w:color="000000"/>
+              <w:top w:val="none" w:sz="0" w:space="0" w:color="000000"/>
+              <w:left w:val="none" w:sz="0" w:space="0" w:color="000000"/>
+              <w:right w:val="none" w:sz="0" w:space="0" w:color="000000"/>
+            </w:tcBorders>
+            <w:shd w:val="clear" w:color="auto" w:fill="FFFFFF"/>
+            <w:tcMar>
+              <w:top w:w="0" w:type="dxa"/>
+              <w:bottom w:w="0" w:type="dxa"/>
+              <w:left w:w="0" w:type="dxa"/>
+              <w:right w:w="0" w:type="dxa"/>
+            </w:tcMar>
+            <w:vAlign w:val="center"/>
+          </w:tcPr>
+          <w:p>
+            <w:pPr>
+              <w:pStyle w:val="Normal"/>
+              <w:jc w:val="center"/>
+              <w:pBdr>
+                <w:bottom w:val="none" w:sz="0" w:space="0" w:color="000000"/>
+                <w:top w:val="none" w:sz="0" w:space="0" w:color="000000"/>
+                <w:left w:val="none" w:sz="0" w:space="0" w:color="000000"/>
+                <w:right w:val="none" w:sz="0" w:space="0" w:color="000000"/>
+              </w:pBdr>
+              <w:spacing w:after="100" w:before="100" w:line="240"/>
+              <w:ind w:left="100" w:right="100" w:firstLine="0" w:firstLineChars="0"/>
+              <w:rPr>
+                <w:rFonts w:ascii="Arial" w:hAnsi="Arial" w:eastAsia="Arial" w:cs="Arial"/>
+                <w:i w:val="false"/>
+                <w:b w:val="false"/>
+                <w:u w:val="none"/>
+                <w:strike w:val="false"/>
+                <w:sz w:val="22"/>
+                <w:szCs w:val="22"/>
+                <w:color w:val="000000"/>
+              </w:rPr>
+            </w:pPr>
+            <w:r>
+              <w:rPr>
+                <w:rFonts w:ascii="Arial" w:hAnsi="Arial" w:eastAsia="Arial" w:cs="Arial"/>
+                <w:i w:val="false"/>
+                <w:b w:val="false"/>
+                <w:u w:val="none"/>
+                <w:strike w:val="false"/>
+                <w:sz w:val="22"/>
+                <w:szCs w:val="22"/>
+                <w:color w:val="000000"/>
+              </w:rPr>
+              <w:t xml:space="preserve">0.27–0.49</w:t>
+            </w:r>
+          </w:p>
+        </w:tc>
+        <w:tc>
+          <w:tcPr>
+            <w:tcBorders>
+              <w:bottom w:val="none" w:sz="0" w:space="0" w:color="000000"/>
+              <w:top w:val="none" w:sz="0" w:space="0" w:color="000000"/>
+              <w:left w:val="none" w:sz="0" w:space="0" w:color="000000"/>
+              <w:right w:val="none" w:sz="0" w:space="0" w:color="000000"/>
+            </w:tcBorders>
+            <w:shd w:val="clear" w:color="auto" w:fill="FFFFFF"/>
+            <w:tcMar>
+              <w:top w:w="0" w:type="dxa"/>
+              <w:bottom w:w="0" w:type="dxa"/>
+              <w:left w:w="0" w:type="dxa"/>
+              <w:right w:w="0" w:type="dxa"/>
+            </w:tcMar>
+            <w:vAlign w:val="center"/>
+          </w:tcPr>
+          <w:p>
+            <w:pPr>
+              <w:pStyle w:val="Normal"/>
+              <w:jc w:val="center"/>
+              <w:pBdr>
+                <w:bottom w:val="none" w:sz="0" w:space="0" w:color="000000"/>
+                <w:top w:val="none" w:sz="0" w:space="0" w:color="000000"/>
+                <w:left w:val="none" w:sz="0" w:space="0" w:color="000000"/>
+                <w:right w:val="none" w:sz="0" w:space="0" w:color="000000"/>
+              </w:pBdr>
+              <w:spacing w:after="100" w:before="100" w:line="240"/>
+              <w:ind w:left="100" w:right="100" w:firstLine="0" w:firstLineChars="0"/>
+              <w:rPr>
+                <w:rFonts w:ascii="Arial" w:hAnsi="Arial" w:eastAsia="Arial" w:cs="Arial"/>
+                <w:i w:val="false"/>
+                <w:b w:val="false"/>
+                <w:u w:val="none"/>
+                <w:strike w:val="false"/>
+                <w:sz w:val="22"/>
+                <w:szCs w:val="22"/>
+                <w:color w:val="000000"/>
+              </w:rPr>
+            </w:pPr>
+            <w:r>
+              <w:rPr>
+                <w:rFonts w:ascii="Arial" w:hAnsi="Arial" w:eastAsia="Arial" w:cs="Arial"/>
+                <w:i w:val="false"/>
+                <w:b w:val="false"/>
+                <w:u w:val="none"/>
+                <w:strike w:val="false"/>
+                <w:sz w:val="22"/>
+                <w:szCs w:val="22"/>
+                <w:color w:val="000000"/>
+              </w:rPr>
+              <w:t xml:space="preserve">5.00</w:t>
+            </w:r>
+          </w:p>
+        </w:tc>
+        <w:tc>
+          <w:tcPr>
+            <w:tcBorders>
+              <w:bottom w:val="none" w:sz="0" w:space="0" w:color="000000"/>
+              <w:top w:val="none" w:sz="0" w:space="0" w:color="000000"/>
+              <w:left w:val="none" w:sz="0" w:space="0" w:color="000000"/>
+              <w:right w:val="none" w:sz="0" w:space="0" w:color="000000"/>
+            </w:tcBorders>
+            <w:shd w:val="clear" w:color="auto" w:fill="FFFFFF"/>
+            <w:tcMar>
+              <w:top w:w="0" w:type="dxa"/>
+              <w:bottom w:w="0" w:type="dxa"/>
+              <w:left w:w="0" w:type="dxa"/>
+              <w:right w:w="0" w:type="dxa"/>
+            </w:tcMar>
+            <w:vAlign w:val="center"/>
+          </w:tcPr>
+          <w:p>
+            <w:pPr>
+              <w:pStyle w:val="Normal"/>
+              <w:jc w:val="center"/>
+              <w:pBdr>
+                <w:bottom w:val="none" w:sz="0" w:space="0" w:color="000000"/>
+                <w:top w:val="none" w:sz="0" w:space="0" w:color="000000"/>
+                <w:left w:val="none" w:sz="0" w:space="0" w:color="000000"/>
+                <w:right w:val="none" w:sz="0" w:space="0" w:color="000000"/>
+              </w:pBdr>
+              <w:spacing w:after="100" w:before="100" w:line="240"/>
+              <w:ind w:left="100" w:right="100" w:firstLine="0" w:firstLineChars="0"/>
+              <w:rPr>
+                <w:rFonts w:ascii="Arial" w:hAnsi="Arial" w:eastAsia="Arial" w:cs="Arial"/>
+                <w:i w:val="false"/>
+                <w:b w:val="false"/>
+                <w:u w:val="none"/>
+                <w:strike w:val="false"/>
+                <w:sz w:val="22"/>
+                <w:szCs w:val="22"/>
+                <w:color w:val="000000"/>
+              </w:rPr>
+            </w:pPr>
+            <w:r>
+              <w:rPr>
+                <w:rFonts w:ascii="Arial" w:hAnsi="Arial" w:eastAsia="Arial" w:cs="Arial"/>
+                <w:i w:val="false"/>
+                <w:b w:val="false"/>
+                <w:u w:val="none"/>
+                <w:strike w:val="false"/>
+                <w:sz w:val="22"/>
+                <w:szCs w:val="22"/>
+                <w:color w:val="000000"/>
+              </w:rPr>
+              <w:t xml:space="preserve">3.50</w:t>
             </w:r>
           </w:p>
         </w:tc>
@@ -2599,227 +2319,227 @@
                 <w:szCs w:val="22"/>
                 <w:color w:val="000000"/>
               </w:rPr>
-              <w:t xml:space="preserve">URCOMPINJadj</w:t>
-            </w:r>
-          </w:p>
-        </w:tc>
-        <w:tc>
-          <w:tcPr>
-            <w:tcBorders>
-              <w:bottom w:val="none" w:sz="0" w:space="0" w:color="000000"/>
-              <w:top w:val="none" w:sz="0" w:space="0" w:color="000000"/>
-              <w:left w:val="none" w:sz="0" w:space="0" w:color="000000"/>
-              <w:right w:val="none" w:sz="0" w:space="0" w:color="000000"/>
-            </w:tcBorders>
-            <w:shd w:val="clear" w:color="auto" w:fill="FFFFFF"/>
-            <w:tcMar>
-              <w:top w:w="0" w:type="dxa"/>
-              <w:bottom w:w="0" w:type="dxa"/>
-              <w:left w:w="0" w:type="dxa"/>
-              <w:right w:w="0" w:type="dxa"/>
-            </w:tcMar>
-            <w:vAlign w:val="center"/>
-          </w:tcPr>
-          <w:p>
-            <w:pPr>
-              <w:pStyle w:val="Normal"/>
-              <w:jc w:val="center"/>
-              <w:pBdr>
-                <w:bottom w:val="none" w:sz="0" w:space="0" w:color="000000"/>
-                <w:top w:val="none" w:sz="0" w:space="0" w:color="000000"/>
-                <w:left w:val="none" w:sz="0" w:space="0" w:color="000000"/>
-                <w:right w:val="none" w:sz="0" w:space="0" w:color="000000"/>
-              </w:pBdr>
-              <w:spacing w:after="100" w:before="100" w:line="240"/>
-              <w:ind w:left="100" w:right="100" w:firstLine="0" w:firstLineChars="0"/>
-              <w:rPr>
-                <w:rFonts w:ascii="Arial" w:hAnsi="Arial" w:eastAsia="Arial" w:cs="Arial"/>
-                <w:i w:val="false"/>
-                <w:b w:val="false"/>
-                <w:u w:val="none"/>
-                <w:strike w:val="false"/>
-                <w:sz w:val="22"/>
-                <w:szCs w:val="22"/>
-                <w:color w:val="000000"/>
-              </w:rPr>
-            </w:pPr>
-            <w:r>
-              <w:rPr>
-                <w:rFonts w:ascii="Arial" w:hAnsi="Arial" w:eastAsia="Arial" w:cs="Arial"/>
-                <w:i w:val="false"/>
-                <w:b w:val="false"/>
-                <w:u w:val="none"/>
-                <w:strike w:val="false"/>
-                <w:sz w:val="22"/>
-                <w:szCs w:val="22"/>
-                <w:color w:val="000000"/>
-              </w:rPr>
-              <w:t xml:space="preserve">0.36</w:t>
-            </w:r>
-          </w:p>
-        </w:tc>
-        <w:tc>
-          <w:tcPr>
-            <w:tcBorders>
-              <w:bottom w:val="none" w:sz="0" w:space="0" w:color="000000"/>
-              <w:top w:val="none" w:sz="0" w:space="0" w:color="000000"/>
-              <w:left w:val="none" w:sz="0" w:space="0" w:color="000000"/>
-              <w:right w:val="none" w:sz="0" w:space="0" w:color="000000"/>
-            </w:tcBorders>
-            <w:shd w:val="clear" w:color="auto" w:fill="FFFFFF"/>
-            <w:tcMar>
-              <w:top w:w="0" w:type="dxa"/>
-              <w:bottom w:w="0" w:type="dxa"/>
-              <w:left w:w="0" w:type="dxa"/>
-              <w:right w:w="0" w:type="dxa"/>
-            </w:tcMar>
-            <w:vAlign w:val="center"/>
-          </w:tcPr>
-          <w:p>
-            <w:pPr>
-              <w:pStyle w:val="Normal"/>
-              <w:jc w:val="center"/>
-              <w:pBdr>
-                <w:bottom w:val="none" w:sz="0" w:space="0" w:color="000000"/>
-                <w:top w:val="none" w:sz="0" w:space="0" w:color="000000"/>
-                <w:left w:val="none" w:sz="0" w:space="0" w:color="000000"/>
-                <w:right w:val="none" w:sz="0" w:space="0" w:color="000000"/>
-              </w:pBdr>
-              <w:spacing w:after="100" w:before="100" w:line="240"/>
-              <w:ind w:left="100" w:right="100" w:firstLine="0" w:firstLineChars="0"/>
-              <w:rPr>
-                <w:rFonts w:ascii="Arial" w:hAnsi="Arial" w:eastAsia="Arial" w:cs="Arial"/>
-                <w:i w:val="false"/>
-                <w:b w:val="false"/>
-                <w:u w:val="none"/>
-                <w:strike w:val="false"/>
-                <w:sz w:val="22"/>
-                <w:szCs w:val="22"/>
-                <w:color w:val="000000"/>
-              </w:rPr>
-            </w:pPr>
-            <w:r>
-              <w:rPr>
-                <w:rFonts w:ascii="Arial" w:hAnsi="Arial" w:eastAsia="Arial" w:cs="Arial"/>
-                <w:i w:val="false"/>
-                <w:b w:val="false"/>
-                <w:u w:val="none"/>
-                <w:strike w:val="false"/>
-                <w:sz w:val="22"/>
-                <w:szCs w:val="22"/>
-                <w:color w:val="000000"/>
-              </w:rPr>
-              <w:t xml:space="preserve">0.27–0.49</w:t>
-            </w:r>
-          </w:p>
-        </w:tc>
-        <w:tc>
-          <w:tcPr>
-            <w:tcBorders>
-              <w:bottom w:val="none" w:sz="0" w:space="0" w:color="000000"/>
-              <w:top w:val="none" w:sz="0" w:space="0" w:color="000000"/>
-              <w:left w:val="none" w:sz="0" w:space="0" w:color="000000"/>
-              <w:right w:val="none" w:sz="0" w:space="0" w:color="000000"/>
-            </w:tcBorders>
-            <w:shd w:val="clear" w:color="auto" w:fill="FFFFFF"/>
-            <w:tcMar>
-              <w:top w:w="0" w:type="dxa"/>
-              <w:bottom w:w="0" w:type="dxa"/>
-              <w:left w:w="0" w:type="dxa"/>
-              <w:right w:w="0" w:type="dxa"/>
-            </w:tcMar>
-            <w:vAlign w:val="center"/>
-          </w:tcPr>
-          <w:p>
-            <w:pPr>
-              <w:pStyle w:val="Normal"/>
-              <w:jc w:val="center"/>
-              <w:pBdr>
-                <w:bottom w:val="none" w:sz="0" w:space="0" w:color="000000"/>
-                <w:top w:val="none" w:sz="0" w:space="0" w:color="000000"/>
-                <w:left w:val="none" w:sz="0" w:space="0" w:color="000000"/>
-                <w:right w:val="none" w:sz="0" w:space="0" w:color="000000"/>
-              </w:pBdr>
-              <w:spacing w:after="100" w:before="100" w:line="240"/>
-              <w:ind w:left="100" w:right="100" w:firstLine="0" w:firstLineChars="0"/>
-              <w:rPr>
-                <w:rFonts w:ascii="Arial" w:hAnsi="Arial" w:eastAsia="Arial" w:cs="Arial"/>
-                <w:i w:val="false"/>
-                <w:b w:val="false"/>
-                <w:u w:val="none"/>
-                <w:strike w:val="false"/>
-                <w:sz w:val="22"/>
-                <w:szCs w:val="22"/>
-                <w:color w:val="000000"/>
-              </w:rPr>
-            </w:pPr>
-            <w:r>
-              <w:rPr>
-                <w:rFonts w:ascii="Arial" w:hAnsi="Arial" w:eastAsia="Arial" w:cs="Arial"/>
-                <w:i w:val="false"/>
-                <w:b w:val="false"/>
-                <w:u w:val="none"/>
-                <w:strike w:val="false"/>
-                <w:sz w:val="22"/>
-                <w:szCs w:val="22"/>
-                <w:color w:val="000000"/>
-              </w:rPr>
-              <w:t xml:space="preserve">5.00</w:t>
-            </w:r>
-          </w:p>
-        </w:tc>
-        <w:tc>
-          <w:tcPr>
-            <w:tcBorders>
-              <w:bottom w:val="none" w:sz="0" w:space="0" w:color="000000"/>
-              <w:top w:val="none" w:sz="0" w:space="0" w:color="000000"/>
-              <w:left w:val="none" w:sz="0" w:space="0" w:color="000000"/>
-              <w:right w:val="none" w:sz="0" w:space="0" w:color="000000"/>
-            </w:tcBorders>
-            <w:shd w:val="clear" w:color="auto" w:fill="FFFFFF"/>
-            <w:tcMar>
-              <w:top w:w="0" w:type="dxa"/>
-              <w:bottom w:w="0" w:type="dxa"/>
-              <w:left w:w="0" w:type="dxa"/>
-              <w:right w:w="0" w:type="dxa"/>
-            </w:tcMar>
-            <w:vAlign w:val="center"/>
-          </w:tcPr>
-          <w:p>
-            <w:pPr>
-              <w:pStyle w:val="Normal"/>
-              <w:jc w:val="center"/>
-              <w:pBdr>
-                <w:bottom w:val="none" w:sz="0" w:space="0" w:color="000000"/>
-                <w:top w:val="none" w:sz="0" w:space="0" w:color="000000"/>
-                <w:left w:val="none" w:sz="0" w:space="0" w:color="000000"/>
-                <w:right w:val="none" w:sz="0" w:space="0" w:color="000000"/>
-              </w:pBdr>
-              <w:spacing w:after="100" w:before="100" w:line="240"/>
-              <w:ind w:left="100" w:right="100" w:firstLine="0" w:firstLineChars="0"/>
-              <w:rPr>
-                <w:rFonts w:ascii="Arial" w:hAnsi="Arial" w:eastAsia="Arial" w:cs="Arial"/>
-                <w:i w:val="false"/>
-                <w:b w:val="false"/>
-                <w:u w:val="none"/>
-                <w:strike w:val="false"/>
-                <w:sz w:val="22"/>
-                <w:szCs w:val="22"/>
-                <w:color w:val="000000"/>
-              </w:rPr>
-            </w:pPr>
-            <w:r>
-              <w:rPr>
-                <w:rFonts w:ascii="Arial" w:hAnsi="Arial" w:eastAsia="Arial" w:cs="Arial"/>
-                <w:i w:val="false"/>
-                <w:b w:val="false"/>
-                <w:u w:val="none"/>
-                <w:strike w:val="false"/>
-                <w:sz w:val="22"/>
-                <w:szCs w:val="22"/>
-                <w:color w:val="000000"/>
-              </w:rPr>
-              <w:t xml:space="preserve">3.50</w:t>
+              <w:t xml:space="preserve">SURGadj</w:t>
+            </w:r>
+          </w:p>
+        </w:tc>
+        <w:tc>
+          <w:tcPr>
+            <w:tcBorders>
+              <w:bottom w:val="none" w:sz="0" w:space="0" w:color="000000"/>
+              <w:top w:val="none" w:sz="0" w:space="0" w:color="000000"/>
+              <w:left w:val="none" w:sz="0" w:space="0" w:color="000000"/>
+              <w:right w:val="none" w:sz="0" w:space="0" w:color="000000"/>
+            </w:tcBorders>
+            <w:shd w:val="clear" w:color="auto" w:fill="FFFFFF"/>
+            <w:tcMar>
+              <w:top w:w="0" w:type="dxa"/>
+              <w:bottom w:w="0" w:type="dxa"/>
+              <w:left w:w="0" w:type="dxa"/>
+              <w:right w:w="0" w:type="dxa"/>
+            </w:tcMar>
+            <w:vAlign w:val="center"/>
+          </w:tcPr>
+          <w:p>
+            <w:pPr>
+              <w:pStyle w:val="Normal"/>
+              <w:jc w:val="center"/>
+              <w:pBdr>
+                <w:bottom w:val="none" w:sz="0" w:space="0" w:color="000000"/>
+                <w:top w:val="none" w:sz="0" w:space="0" w:color="000000"/>
+                <w:left w:val="none" w:sz="0" w:space="0" w:color="000000"/>
+                <w:right w:val="none" w:sz="0" w:space="0" w:color="000000"/>
+              </w:pBdr>
+              <w:spacing w:after="100" w:before="100" w:line="240"/>
+              <w:ind w:left="100" w:right="100" w:firstLine="0" w:firstLineChars="0"/>
+              <w:rPr>
+                <w:rFonts w:ascii="Arial" w:hAnsi="Arial" w:eastAsia="Arial" w:cs="Arial"/>
+                <w:i w:val="false"/>
+                <w:b w:val="false"/>
+                <w:u w:val="none"/>
+                <w:strike w:val="false"/>
+                <w:sz w:val="22"/>
+                <w:szCs w:val="22"/>
+                <w:color w:val="000000"/>
+              </w:rPr>
+            </w:pPr>
+            <w:r>
+              <w:rPr>
+                <w:rFonts w:ascii="Arial" w:hAnsi="Arial" w:eastAsia="Arial" w:cs="Arial"/>
+                <w:i w:val="false"/>
+                <w:b w:val="false"/>
+                <w:u w:val="none"/>
+                <w:strike w:val="false"/>
+                <w:sz w:val="22"/>
+                <w:szCs w:val="22"/>
+                <w:color w:val="000000"/>
+              </w:rPr>
+              <w:t xml:space="preserve">0.63</w:t>
+            </w:r>
+          </w:p>
+        </w:tc>
+        <w:tc>
+          <w:tcPr>
+            <w:tcBorders>
+              <w:bottom w:val="none" w:sz="0" w:space="0" w:color="000000"/>
+              <w:top w:val="none" w:sz="0" w:space="0" w:color="000000"/>
+              <w:left w:val="none" w:sz="0" w:space="0" w:color="000000"/>
+              <w:right w:val="none" w:sz="0" w:space="0" w:color="000000"/>
+            </w:tcBorders>
+            <w:shd w:val="clear" w:color="auto" w:fill="FFFFFF"/>
+            <w:tcMar>
+              <w:top w:w="0" w:type="dxa"/>
+              <w:bottom w:w="0" w:type="dxa"/>
+              <w:left w:w="0" w:type="dxa"/>
+              <w:right w:w="0" w:type="dxa"/>
+            </w:tcMar>
+            <w:vAlign w:val="center"/>
+          </w:tcPr>
+          <w:p>
+            <w:pPr>
+              <w:pStyle w:val="Normal"/>
+              <w:jc w:val="center"/>
+              <w:pBdr>
+                <w:bottom w:val="none" w:sz="0" w:space="0" w:color="000000"/>
+                <w:top w:val="none" w:sz="0" w:space="0" w:color="000000"/>
+                <w:left w:val="none" w:sz="0" w:space="0" w:color="000000"/>
+                <w:right w:val="none" w:sz="0" w:space="0" w:color="000000"/>
+              </w:pBdr>
+              <w:spacing w:after="100" w:before="100" w:line="240"/>
+              <w:ind w:left="100" w:right="100" w:firstLine="0" w:firstLineChars="0"/>
+              <w:rPr>
+                <w:rFonts w:ascii="Arial" w:hAnsi="Arial" w:eastAsia="Arial" w:cs="Arial"/>
+                <w:i w:val="false"/>
+                <w:b w:val="false"/>
+                <w:u w:val="none"/>
+                <w:strike w:val="false"/>
+                <w:sz w:val="22"/>
+                <w:szCs w:val="22"/>
+                <w:color w:val="000000"/>
+              </w:rPr>
+            </w:pPr>
+            <w:r>
+              <w:rPr>
+                <w:rFonts w:ascii="Arial" w:hAnsi="Arial" w:eastAsia="Arial" w:cs="Arial"/>
+                <w:i w:val="false"/>
+                <w:b w:val="false"/>
+                <w:u w:val="none"/>
+                <w:strike w:val="false"/>
+                <w:sz w:val="22"/>
+                <w:szCs w:val="22"/>
+                <w:color w:val="000000"/>
+              </w:rPr>
+              <w:t xml:space="preserve">0.50–0.81</w:t>
+            </w:r>
+          </w:p>
+        </w:tc>
+        <w:tc>
+          <w:tcPr>
+            <w:tcBorders>
+              <w:bottom w:val="none" w:sz="0" w:space="0" w:color="000000"/>
+              <w:top w:val="none" w:sz="0" w:space="0" w:color="000000"/>
+              <w:left w:val="none" w:sz="0" w:space="0" w:color="000000"/>
+              <w:right w:val="none" w:sz="0" w:space="0" w:color="000000"/>
+            </w:tcBorders>
+            <w:shd w:val="clear" w:color="auto" w:fill="FFFFFF"/>
+            <w:tcMar>
+              <w:top w:w="0" w:type="dxa"/>
+              <w:bottom w:w="0" w:type="dxa"/>
+              <w:left w:w="0" w:type="dxa"/>
+              <w:right w:w="0" w:type="dxa"/>
+            </w:tcMar>
+            <w:vAlign w:val="center"/>
+          </w:tcPr>
+          <w:p>
+            <w:pPr>
+              <w:pStyle w:val="Normal"/>
+              <w:jc w:val="center"/>
+              <w:pBdr>
+                <w:bottom w:val="none" w:sz="0" w:space="0" w:color="000000"/>
+                <w:top w:val="none" w:sz="0" w:space="0" w:color="000000"/>
+                <w:left w:val="none" w:sz="0" w:space="0" w:color="000000"/>
+                <w:right w:val="none" w:sz="0" w:space="0" w:color="000000"/>
+              </w:pBdr>
+              <w:spacing w:after="100" w:before="100" w:line="240"/>
+              <w:ind w:left="100" w:right="100" w:firstLine="0" w:firstLineChars="0"/>
+              <w:rPr>
+                <w:rFonts w:ascii="Arial" w:hAnsi="Arial" w:eastAsia="Arial" w:cs="Arial"/>
+                <w:i w:val="false"/>
+                <w:b w:val="false"/>
+                <w:u w:val="none"/>
+                <w:strike w:val="false"/>
+                <w:sz w:val="22"/>
+                <w:szCs w:val="22"/>
+                <w:color w:val="000000"/>
+              </w:rPr>
+            </w:pPr>
+            <w:r>
+              <w:rPr>
+                <w:rFonts w:ascii="Arial" w:hAnsi="Arial" w:eastAsia="Arial" w:cs="Arial"/>
+                <w:i w:val="false"/>
+                <w:b w:val="false"/>
+                <w:u w:val="none"/>
+                <w:strike w:val="false"/>
+                <w:sz w:val="22"/>
+                <w:szCs w:val="22"/>
+                <w:color w:val="000000"/>
+              </w:rPr>
+              <w:t xml:space="preserve">1.83</w:t>
+            </w:r>
+          </w:p>
+        </w:tc>
+        <w:tc>
+          <w:tcPr>
+            <w:tcBorders>
+              <w:bottom w:val="none" w:sz="0" w:space="0" w:color="000000"/>
+              <w:top w:val="none" w:sz="0" w:space="0" w:color="000000"/>
+              <w:left w:val="none" w:sz="0" w:space="0" w:color="000000"/>
+              <w:right w:val="none" w:sz="0" w:space="0" w:color="000000"/>
+            </w:tcBorders>
+            <w:shd w:val="clear" w:color="auto" w:fill="FFFFFF"/>
+            <w:tcMar>
+              <w:top w:w="0" w:type="dxa"/>
+              <w:bottom w:w="0" w:type="dxa"/>
+              <w:left w:w="0" w:type="dxa"/>
+              <w:right w:w="0" w:type="dxa"/>
+            </w:tcMar>
+            <w:vAlign w:val="center"/>
+          </w:tcPr>
+          <w:p>
+            <w:pPr>
+              <w:pStyle w:val="Normal"/>
+              <w:jc w:val="center"/>
+              <w:pBdr>
+                <w:bottom w:val="none" w:sz="0" w:space="0" w:color="000000"/>
+                <w:top w:val="none" w:sz="0" w:space="0" w:color="000000"/>
+                <w:left w:val="none" w:sz="0" w:space="0" w:color="000000"/>
+                <w:right w:val="none" w:sz="0" w:space="0" w:color="000000"/>
+              </w:pBdr>
+              <w:spacing w:after="100" w:before="100" w:line="240"/>
+              <w:ind w:left="100" w:right="100" w:firstLine="0" w:firstLineChars="0"/>
+              <w:rPr>
+                <w:rFonts w:ascii="Arial" w:hAnsi="Arial" w:eastAsia="Arial" w:cs="Arial"/>
+                <w:i w:val="false"/>
+                <w:b w:val="false"/>
+                <w:u w:val="none"/>
+                <w:strike w:val="false"/>
+                <w:sz w:val="22"/>
+                <w:szCs w:val="22"/>
+                <w:color w:val="000000"/>
+              </w:rPr>
+            </w:pPr>
+            <w:r>
+              <w:rPr>
+                <w:rFonts w:ascii="Arial" w:hAnsi="Arial" w:eastAsia="Arial" w:cs="Arial"/>
+                <w:i w:val="false"/>
+                <w:b w:val="false"/>
+                <w:u w:val="none"/>
+                <w:strike w:val="false"/>
+                <w:sz w:val="22"/>
+                <w:szCs w:val="22"/>
+                <w:color w:val="000000"/>
+              </w:rPr>
+              <w:t xml:space="preserve">1.46</w:t>
             </w:r>
           </w:p>
         </w:tc>
@@ -2879,227 +2599,227 @@
                 <w:szCs w:val="22"/>
                 <w:color w:val="000000"/>
               </w:rPr>
-              <w:t xml:space="preserve">SURGadj</w:t>
-            </w:r>
-          </w:p>
-        </w:tc>
-        <w:tc>
-          <w:tcPr>
-            <w:tcBorders>
-              <w:bottom w:val="none" w:sz="0" w:space="0" w:color="000000"/>
-              <w:top w:val="none" w:sz="0" w:space="0" w:color="000000"/>
-              <w:left w:val="none" w:sz="0" w:space="0" w:color="000000"/>
-              <w:right w:val="none" w:sz="0" w:space="0" w:color="000000"/>
-            </w:tcBorders>
-            <w:shd w:val="clear" w:color="auto" w:fill="FFFFFF"/>
-            <w:tcMar>
-              <w:top w:w="0" w:type="dxa"/>
-              <w:bottom w:w="0" w:type="dxa"/>
-              <w:left w:w="0" w:type="dxa"/>
-              <w:right w:w="0" w:type="dxa"/>
-            </w:tcMar>
-            <w:vAlign w:val="center"/>
-          </w:tcPr>
-          <w:p>
-            <w:pPr>
-              <w:pStyle w:val="Normal"/>
-              <w:jc w:val="center"/>
-              <w:pBdr>
-                <w:bottom w:val="none" w:sz="0" w:space="0" w:color="000000"/>
-                <w:top w:val="none" w:sz="0" w:space="0" w:color="000000"/>
-                <w:left w:val="none" w:sz="0" w:space="0" w:color="000000"/>
-                <w:right w:val="none" w:sz="0" w:space="0" w:color="000000"/>
-              </w:pBdr>
-              <w:spacing w:after="100" w:before="100" w:line="240"/>
-              <w:ind w:left="100" w:right="100" w:firstLine="0" w:firstLineChars="0"/>
-              <w:rPr>
-                <w:rFonts w:ascii="Arial" w:hAnsi="Arial" w:eastAsia="Arial" w:cs="Arial"/>
-                <w:i w:val="false"/>
-                <w:b w:val="false"/>
-                <w:u w:val="none"/>
-                <w:strike w:val="false"/>
-                <w:sz w:val="22"/>
-                <w:szCs w:val="22"/>
-                <w:color w:val="000000"/>
-              </w:rPr>
-            </w:pPr>
-            <w:r>
-              <w:rPr>
-                <w:rFonts w:ascii="Arial" w:hAnsi="Arial" w:eastAsia="Arial" w:cs="Arial"/>
-                <w:i w:val="false"/>
-                <w:b w:val="false"/>
-                <w:u w:val="none"/>
-                <w:strike w:val="false"/>
-                <w:sz w:val="22"/>
-                <w:szCs w:val="22"/>
-                <w:color w:val="000000"/>
-              </w:rPr>
-              <w:t xml:space="preserve">0.63</w:t>
-            </w:r>
-          </w:p>
-        </w:tc>
-        <w:tc>
-          <w:tcPr>
-            <w:tcBorders>
-              <w:bottom w:val="none" w:sz="0" w:space="0" w:color="000000"/>
-              <w:top w:val="none" w:sz="0" w:space="0" w:color="000000"/>
-              <w:left w:val="none" w:sz="0" w:space="0" w:color="000000"/>
-              <w:right w:val="none" w:sz="0" w:space="0" w:color="000000"/>
-            </w:tcBorders>
-            <w:shd w:val="clear" w:color="auto" w:fill="FFFFFF"/>
-            <w:tcMar>
-              <w:top w:w="0" w:type="dxa"/>
-              <w:bottom w:w="0" w:type="dxa"/>
-              <w:left w:w="0" w:type="dxa"/>
-              <w:right w:w="0" w:type="dxa"/>
-            </w:tcMar>
-            <w:vAlign w:val="center"/>
-          </w:tcPr>
-          <w:p>
-            <w:pPr>
-              <w:pStyle w:val="Normal"/>
-              <w:jc w:val="center"/>
-              <w:pBdr>
-                <w:bottom w:val="none" w:sz="0" w:space="0" w:color="000000"/>
-                <w:top w:val="none" w:sz="0" w:space="0" w:color="000000"/>
-                <w:left w:val="none" w:sz="0" w:space="0" w:color="000000"/>
-                <w:right w:val="none" w:sz="0" w:space="0" w:color="000000"/>
-              </w:pBdr>
-              <w:spacing w:after="100" w:before="100" w:line="240"/>
-              <w:ind w:left="100" w:right="100" w:firstLine="0" w:firstLineChars="0"/>
-              <w:rPr>
-                <w:rFonts w:ascii="Arial" w:hAnsi="Arial" w:eastAsia="Arial" w:cs="Arial"/>
-                <w:i w:val="false"/>
-                <w:b w:val="false"/>
-                <w:u w:val="none"/>
-                <w:strike w:val="false"/>
-                <w:sz w:val="22"/>
-                <w:szCs w:val="22"/>
-                <w:color w:val="000000"/>
-              </w:rPr>
-            </w:pPr>
-            <w:r>
-              <w:rPr>
-                <w:rFonts w:ascii="Arial" w:hAnsi="Arial" w:eastAsia="Arial" w:cs="Arial"/>
-                <w:i w:val="false"/>
-                <w:b w:val="false"/>
-                <w:u w:val="none"/>
-                <w:strike w:val="false"/>
-                <w:sz w:val="22"/>
-                <w:szCs w:val="22"/>
-                <w:color w:val="000000"/>
-              </w:rPr>
-              <w:t xml:space="preserve">0.50–0.81</w:t>
-            </w:r>
-          </w:p>
-        </w:tc>
-        <w:tc>
-          <w:tcPr>
-            <w:tcBorders>
-              <w:bottom w:val="none" w:sz="0" w:space="0" w:color="000000"/>
-              <w:top w:val="none" w:sz="0" w:space="0" w:color="000000"/>
-              <w:left w:val="none" w:sz="0" w:space="0" w:color="000000"/>
-              <w:right w:val="none" w:sz="0" w:space="0" w:color="000000"/>
-            </w:tcBorders>
-            <w:shd w:val="clear" w:color="auto" w:fill="FFFFFF"/>
-            <w:tcMar>
-              <w:top w:w="0" w:type="dxa"/>
-              <w:bottom w:w="0" w:type="dxa"/>
-              <w:left w:w="0" w:type="dxa"/>
-              <w:right w:w="0" w:type="dxa"/>
-            </w:tcMar>
-            <w:vAlign w:val="center"/>
-          </w:tcPr>
-          <w:p>
-            <w:pPr>
-              <w:pStyle w:val="Normal"/>
-              <w:jc w:val="center"/>
-              <w:pBdr>
-                <w:bottom w:val="none" w:sz="0" w:space="0" w:color="000000"/>
-                <w:top w:val="none" w:sz="0" w:space="0" w:color="000000"/>
-                <w:left w:val="none" w:sz="0" w:space="0" w:color="000000"/>
-                <w:right w:val="none" w:sz="0" w:space="0" w:color="000000"/>
-              </w:pBdr>
-              <w:spacing w:after="100" w:before="100" w:line="240"/>
-              <w:ind w:left="100" w:right="100" w:firstLine="0" w:firstLineChars="0"/>
-              <w:rPr>
-                <w:rFonts w:ascii="Arial" w:hAnsi="Arial" w:eastAsia="Arial" w:cs="Arial"/>
-                <w:i w:val="false"/>
-                <w:b w:val="false"/>
-                <w:u w:val="none"/>
-                <w:strike w:val="false"/>
-                <w:sz w:val="22"/>
-                <w:szCs w:val="22"/>
-                <w:color w:val="000000"/>
-              </w:rPr>
-            </w:pPr>
-            <w:r>
-              <w:rPr>
-                <w:rFonts w:ascii="Arial" w:hAnsi="Arial" w:eastAsia="Arial" w:cs="Arial"/>
-                <w:i w:val="false"/>
-                <w:b w:val="false"/>
-                <w:u w:val="none"/>
-                <w:strike w:val="false"/>
-                <w:sz w:val="22"/>
-                <w:szCs w:val="22"/>
-                <w:color w:val="000000"/>
-              </w:rPr>
-              <w:t xml:space="preserve">1.83</w:t>
-            </w:r>
-          </w:p>
-        </w:tc>
-        <w:tc>
-          <w:tcPr>
-            <w:tcBorders>
-              <w:bottom w:val="none" w:sz="0" w:space="0" w:color="000000"/>
-              <w:top w:val="none" w:sz="0" w:space="0" w:color="000000"/>
-              <w:left w:val="none" w:sz="0" w:space="0" w:color="000000"/>
-              <w:right w:val="none" w:sz="0" w:space="0" w:color="000000"/>
-            </w:tcBorders>
-            <w:shd w:val="clear" w:color="auto" w:fill="FFFFFF"/>
-            <w:tcMar>
-              <w:top w:w="0" w:type="dxa"/>
-              <w:bottom w:w="0" w:type="dxa"/>
-              <w:left w:w="0" w:type="dxa"/>
-              <w:right w:w="0" w:type="dxa"/>
-            </w:tcMar>
-            <w:vAlign w:val="center"/>
-          </w:tcPr>
-          <w:p>
-            <w:pPr>
-              <w:pStyle w:val="Normal"/>
-              <w:jc w:val="center"/>
-              <w:pBdr>
-                <w:bottom w:val="none" w:sz="0" w:space="0" w:color="000000"/>
-                <w:top w:val="none" w:sz="0" w:space="0" w:color="000000"/>
-                <w:left w:val="none" w:sz="0" w:space="0" w:color="000000"/>
-                <w:right w:val="none" w:sz="0" w:space="0" w:color="000000"/>
-              </w:pBdr>
-              <w:spacing w:after="100" w:before="100" w:line="240"/>
-              <w:ind w:left="100" w:right="100" w:firstLine="0" w:firstLineChars="0"/>
-              <w:rPr>
-                <w:rFonts w:ascii="Arial" w:hAnsi="Arial" w:eastAsia="Arial" w:cs="Arial"/>
-                <w:i w:val="false"/>
-                <w:b w:val="false"/>
-                <w:u w:val="none"/>
-                <w:strike w:val="false"/>
-                <w:sz w:val="22"/>
-                <w:szCs w:val="22"/>
-                <w:color w:val="000000"/>
-              </w:rPr>
-            </w:pPr>
-            <w:r>
-              <w:rPr>
-                <w:rFonts w:ascii="Arial" w:hAnsi="Arial" w:eastAsia="Arial" w:cs="Arial"/>
-                <w:i w:val="false"/>
-                <w:b w:val="false"/>
-                <w:u w:val="none"/>
-                <w:strike w:val="false"/>
-                <w:sz w:val="22"/>
-                <w:szCs w:val="22"/>
-                <w:color w:val="000000"/>
-              </w:rPr>
-              <w:t xml:space="preserve">1.46</w:t>
+              <w:t xml:space="preserve">ILEUSadj</w:t>
+            </w:r>
+          </w:p>
+        </w:tc>
+        <w:tc>
+          <w:tcPr>
+            <w:tcBorders>
+              <w:bottom w:val="none" w:sz="0" w:space="0" w:color="000000"/>
+              <w:top w:val="none" w:sz="0" w:space="0" w:color="000000"/>
+              <w:left w:val="none" w:sz="0" w:space="0" w:color="000000"/>
+              <w:right w:val="none" w:sz="0" w:space="0" w:color="000000"/>
+            </w:tcBorders>
+            <w:shd w:val="clear" w:color="auto" w:fill="FFFFFF"/>
+            <w:tcMar>
+              <w:top w:w="0" w:type="dxa"/>
+              <w:bottom w:w="0" w:type="dxa"/>
+              <w:left w:w="0" w:type="dxa"/>
+              <w:right w:w="0" w:type="dxa"/>
+            </w:tcMar>
+            <w:vAlign w:val="center"/>
+          </w:tcPr>
+          <w:p>
+            <w:pPr>
+              <w:pStyle w:val="Normal"/>
+              <w:jc w:val="center"/>
+              <w:pBdr>
+                <w:bottom w:val="none" w:sz="0" w:space="0" w:color="000000"/>
+                <w:top w:val="none" w:sz="0" w:space="0" w:color="000000"/>
+                <w:left w:val="none" w:sz="0" w:space="0" w:color="000000"/>
+                <w:right w:val="none" w:sz="0" w:space="0" w:color="000000"/>
+              </w:pBdr>
+              <w:spacing w:after="100" w:before="100" w:line="240"/>
+              <w:ind w:left="100" w:right="100" w:firstLine="0" w:firstLineChars="0"/>
+              <w:rPr>
+                <w:rFonts w:ascii="Arial" w:hAnsi="Arial" w:eastAsia="Arial" w:cs="Arial"/>
+                <w:i w:val="false"/>
+                <w:b w:val="false"/>
+                <w:u w:val="none"/>
+                <w:strike w:val="false"/>
+                <w:sz w:val="22"/>
+                <w:szCs w:val="22"/>
+                <w:color w:val="000000"/>
+              </w:rPr>
+            </w:pPr>
+            <w:r>
+              <w:rPr>
+                <w:rFonts w:ascii="Arial" w:hAnsi="Arial" w:eastAsia="Arial" w:cs="Arial"/>
+                <w:i w:val="false"/>
+                <w:b w:val="false"/>
+                <w:u w:val="none"/>
+                <w:strike w:val="false"/>
+                <w:sz w:val="22"/>
+                <w:szCs w:val="22"/>
+                <w:color w:val="000000"/>
+              </w:rPr>
+              <w:t xml:space="preserve">0.20</w:t>
+            </w:r>
+          </w:p>
+        </w:tc>
+        <w:tc>
+          <w:tcPr>
+            <w:tcBorders>
+              <w:bottom w:val="none" w:sz="0" w:space="0" w:color="000000"/>
+              <w:top w:val="none" w:sz="0" w:space="0" w:color="000000"/>
+              <w:left w:val="none" w:sz="0" w:space="0" w:color="000000"/>
+              <w:right w:val="none" w:sz="0" w:space="0" w:color="000000"/>
+            </w:tcBorders>
+            <w:shd w:val="clear" w:color="auto" w:fill="FFFFFF"/>
+            <w:tcMar>
+              <w:top w:w="0" w:type="dxa"/>
+              <w:bottom w:w="0" w:type="dxa"/>
+              <w:left w:w="0" w:type="dxa"/>
+              <w:right w:w="0" w:type="dxa"/>
+            </w:tcMar>
+            <w:vAlign w:val="center"/>
+          </w:tcPr>
+          <w:p>
+            <w:pPr>
+              <w:pStyle w:val="Normal"/>
+              <w:jc w:val="center"/>
+              <w:pBdr>
+                <w:bottom w:val="none" w:sz="0" w:space="0" w:color="000000"/>
+                <w:top w:val="none" w:sz="0" w:space="0" w:color="000000"/>
+                <w:left w:val="none" w:sz="0" w:space="0" w:color="000000"/>
+                <w:right w:val="none" w:sz="0" w:space="0" w:color="000000"/>
+              </w:pBdr>
+              <w:spacing w:after="100" w:before="100" w:line="240"/>
+              <w:ind w:left="100" w:right="100" w:firstLine="0" w:firstLineChars="0"/>
+              <w:rPr>
+                <w:rFonts w:ascii="Arial" w:hAnsi="Arial" w:eastAsia="Arial" w:cs="Arial"/>
+                <w:i w:val="false"/>
+                <w:b w:val="false"/>
+                <w:u w:val="none"/>
+                <w:strike w:val="false"/>
+                <w:sz w:val="22"/>
+                <w:szCs w:val="22"/>
+                <w:color w:val="000000"/>
+              </w:rPr>
+            </w:pPr>
+            <w:r>
+              <w:rPr>
+                <w:rFonts w:ascii="Arial" w:hAnsi="Arial" w:eastAsia="Arial" w:cs="Arial"/>
+                <w:i w:val="false"/>
+                <w:b w:val="false"/>
+                <w:u w:val="none"/>
+                <w:strike w:val="false"/>
+                <w:sz w:val="22"/>
+                <w:szCs w:val="22"/>
+                <w:color w:val="000000"/>
+              </w:rPr>
+              <w:t xml:space="preserve">0.17–0.24</w:t>
+            </w:r>
+          </w:p>
+        </w:tc>
+        <w:tc>
+          <w:tcPr>
+            <w:tcBorders>
+              <w:bottom w:val="none" w:sz="0" w:space="0" w:color="000000"/>
+              <w:top w:val="none" w:sz="0" w:space="0" w:color="000000"/>
+              <w:left w:val="none" w:sz="0" w:space="0" w:color="000000"/>
+              <w:right w:val="none" w:sz="0" w:space="0" w:color="000000"/>
+            </w:tcBorders>
+            <w:shd w:val="clear" w:color="auto" w:fill="FFFFFF"/>
+            <w:tcMar>
+              <w:top w:w="0" w:type="dxa"/>
+              <w:bottom w:w="0" w:type="dxa"/>
+              <w:left w:w="0" w:type="dxa"/>
+              <w:right w:w="0" w:type="dxa"/>
+            </w:tcMar>
+            <w:vAlign w:val="center"/>
+          </w:tcPr>
+          <w:p>
+            <w:pPr>
+              <w:pStyle w:val="Normal"/>
+              <w:jc w:val="center"/>
+              <w:pBdr>
+                <w:bottom w:val="none" w:sz="0" w:space="0" w:color="000000"/>
+                <w:top w:val="none" w:sz="0" w:space="0" w:color="000000"/>
+                <w:left w:val="none" w:sz="0" w:space="0" w:color="000000"/>
+                <w:right w:val="none" w:sz="0" w:space="0" w:color="000000"/>
+              </w:pBdr>
+              <w:spacing w:after="100" w:before="100" w:line="240"/>
+              <w:ind w:left="100" w:right="100" w:firstLine="0" w:firstLineChars="0"/>
+              <w:rPr>
+                <w:rFonts w:ascii="Arial" w:hAnsi="Arial" w:eastAsia="Arial" w:cs="Arial"/>
+                <w:i w:val="false"/>
+                <w:b w:val="false"/>
+                <w:u w:val="none"/>
+                <w:strike w:val="false"/>
+                <w:sz w:val="22"/>
+                <w:szCs w:val="22"/>
+                <w:color w:val="000000"/>
+              </w:rPr>
+            </w:pPr>
+            <w:r>
+              <w:rPr>
+                <w:rFonts w:ascii="Arial" w:hAnsi="Arial" w:eastAsia="Arial" w:cs="Arial"/>
+                <w:i w:val="false"/>
+                <w:b w:val="false"/>
+                <w:u w:val="none"/>
+                <w:strike w:val="false"/>
+                <w:sz w:val="22"/>
+                <w:szCs w:val="22"/>
+                <w:color w:val="000000"/>
+              </w:rPr>
+              <w:t xml:space="preserve">9.47</w:t>
+            </w:r>
+          </w:p>
+        </w:tc>
+        <w:tc>
+          <w:tcPr>
+            <w:tcBorders>
+              <w:bottom w:val="none" w:sz="0" w:space="0" w:color="000000"/>
+              <w:top w:val="none" w:sz="0" w:space="0" w:color="000000"/>
+              <w:left w:val="none" w:sz="0" w:space="0" w:color="000000"/>
+              <w:right w:val="none" w:sz="0" w:space="0" w:color="000000"/>
+            </w:tcBorders>
+            <w:shd w:val="clear" w:color="auto" w:fill="FFFFFF"/>
+            <w:tcMar>
+              <w:top w:w="0" w:type="dxa"/>
+              <w:bottom w:w="0" w:type="dxa"/>
+              <w:left w:w="0" w:type="dxa"/>
+              <w:right w:w="0" w:type="dxa"/>
+            </w:tcMar>
+            <w:vAlign w:val="center"/>
+          </w:tcPr>
+          <w:p>
+            <w:pPr>
+              <w:pStyle w:val="Normal"/>
+              <w:jc w:val="center"/>
+              <w:pBdr>
+                <w:bottom w:val="none" w:sz="0" w:space="0" w:color="000000"/>
+                <w:top w:val="none" w:sz="0" w:space="0" w:color="000000"/>
+                <w:left w:val="none" w:sz="0" w:space="0" w:color="000000"/>
+                <w:right w:val="none" w:sz="0" w:space="0" w:color="000000"/>
+              </w:pBdr>
+              <w:spacing w:after="100" w:before="100" w:line="240"/>
+              <w:ind w:left="100" w:right="100" w:firstLine="0" w:firstLineChars="0"/>
+              <w:rPr>
+                <w:rFonts w:ascii="Arial" w:hAnsi="Arial" w:eastAsia="Arial" w:cs="Arial"/>
+                <w:i w:val="false"/>
+                <w:b w:val="false"/>
+                <w:u w:val="none"/>
+                <w:strike w:val="false"/>
+                <w:sz w:val="22"/>
+                <w:szCs w:val="22"/>
+                <w:color w:val="000000"/>
+              </w:rPr>
+            </w:pPr>
+            <w:r>
+              <w:rPr>
+                <w:rFonts w:ascii="Arial" w:hAnsi="Arial" w:eastAsia="Arial" w:cs="Arial"/>
+                <w:i w:val="false"/>
+                <w:b w:val="false"/>
+                <w:u w:val="none"/>
+                <w:strike w:val="false"/>
+                <w:sz w:val="22"/>
+                <w:szCs w:val="22"/>
+                <w:color w:val="000000"/>
+              </w:rPr>
+              <w:t xml:space="preserve">7.80</w:t>
             </w:r>
           </w:p>
         </w:tc>
@@ -3159,286 +2879,6 @@
                 <w:szCs w:val="22"/>
                 <w:color w:val="000000"/>
               </w:rPr>
-              <w:t xml:space="preserve">ILEUSadj</w:t>
-            </w:r>
-          </w:p>
-        </w:tc>
-        <w:tc>
-          <w:tcPr>
-            <w:tcBorders>
-              <w:bottom w:val="none" w:sz="0" w:space="0" w:color="000000"/>
-              <w:top w:val="none" w:sz="0" w:space="0" w:color="000000"/>
-              <w:left w:val="none" w:sz="0" w:space="0" w:color="000000"/>
-              <w:right w:val="none" w:sz="0" w:space="0" w:color="000000"/>
-            </w:tcBorders>
-            <w:shd w:val="clear" w:color="auto" w:fill="FFFFFF"/>
-            <w:tcMar>
-              <w:top w:w="0" w:type="dxa"/>
-              <w:bottom w:w="0" w:type="dxa"/>
-              <w:left w:w="0" w:type="dxa"/>
-              <w:right w:w="0" w:type="dxa"/>
-            </w:tcMar>
-            <w:vAlign w:val="center"/>
-          </w:tcPr>
-          <w:p>
-            <w:pPr>
-              <w:pStyle w:val="Normal"/>
-              <w:jc w:val="center"/>
-              <w:pBdr>
-                <w:bottom w:val="none" w:sz="0" w:space="0" w:color="000000"/>
-                <w:top w:val="none" w:sz="0" w:space="0" w:color="000000"/>
-                <w:left w:val="none" w:sz="0" w:space="0" w:color="000000"/>
-                <w:right w:val="none" w:sz="0" w:space="0" w:color="000000"/>
-              </w:pBdr>
-              <w:spacing w:after="100" w:before="100" w:line="240"/>
-              <w:ind w:left="100" w:right="100" w:firstLine="0" w:firstLineChars="0"/>
-              <w:rPr>
-                <w:rFonts w:ascii="Arial" w:hAnsi="Arial" w:eastAsia="Arial" w:cs="Arial"/>
-                <w:i w:val="false"/>
-                <w:b w:val="false"/>
-                <w:u w:val="none"/>
-                <w:strike w:val="false"/>
-                <w:sz w:val="22"/>
-                <w:szCs w:val="22"/>
-                <w:color w:val="000000"/>
-              </w:rPr>
-            </w:pPr>
-            <w:r>
-              <w:rPr>
-                <w:rFonts w:ascii="Arial" w:hAnsi="Arial" w:eastAsia="Arial" w:cs="Arial"/>
-                <w:i w:val="false"/>
-                <w:b w:val="false"/>
-                <w:u w:val="none"/>
-                <w:strike w:val="false"/>
-                <w:sz w:val="22"/>
-                <w:szCs w:val="22"/>
-                <w:color w:val="000000"/>
-              </w:rPr>
-              <w:t xml:space="preserve">0.20</w:t>
-            </w:r>
-          </w:p>
-        </w:tc>
-        <w:tc>
-          <w:tcPr>
-            <w:tcBorders>
-              <w:bottom w:val="none" w:sz="0" w:space="0" w:color="000000"/>
-              <w:top w:val="none" w:sz="0" w:space="0" w:color="000000"/>
-              <w:left w:val="none" w:sz="0" w:space="0" w:color="000000"/>
-              <w:right w:val="none" w:sz="0" w:space="0" w:color="000000"/>
-            </w:tcBorders>
-            <w:shd w:val="clear" w:color="auto" w:fill="FFFFFF"/>
-            <w:tcMar>
-              <w:top w:w="0" w:type="dxa"/>
-              <w:bottom w:w="0" w:type="dxa"/>
-              <w:left w:w="0" w:type="dxa"/>
-              <w:right w:w="0" w:type="dxa"/>
-            </w:tcMar>
-            <w:vAlign w:val="center"/>
-          </w:tcPr>
-          <w:p>
-            <w:pPr>
-              <w:pStyle w:val="Normal"/>
-              <w:jc w:val="center"/>
-              <w:pBdr>
-                <w:bottom w:val="none" w:sz="0" w:space="0" w:color="000000"/>
-                <w:top w:val="none" w:sz="0" w:space="0" w:color="000000"/>
-                <w:left w:val="none" w:sz="0" w:space="0" w:color="000000"/>
-                <w:right w:val="none" w:sz="0" w:space="0" w:color="000000"/>
-              </w:pBdr>
-              <w:spacing w:after="100" w:before="100" w:line="240"/>
-              <w:ind w:left="100" w:right="100" w:firstLine="0" w:firstLineChars="0"/>
-              <w:rPr>
-                <w:rFonts w:ascii="Arial" w:hAnsi="Arial" w:eastAsia="Arial" w:cs="Arial"/>
-                <w:i w:val="false"/>
-                <w:b w:val="false"/>
-                <w:u w:val="none"/>
-                <w:strike w:val="false"/>
-                <w:sz w:val="22"/>
-                <w:szCs w:val="22"/>
-                <w:color w:val="000000"/>
-              </w:rPr>
-            </w:pPr>
-            <w:r>
-              <w:rPr>
-                <w:rFonts w:ascii="Arial" w:hAnsi="Arial" w:eastAsia="Arial" w:cs="Arial"/>
-                <w:i w:val="false"/>
-                <w:b w:val="false"/>
-                <w:u w:val="none"/>
-                <w:strike w:val="false"/>
-                <w:sz w:val="22"/>
-                <w:szCs w:val="22"/>
-                <w:color w:val="000000"/>
-              </w:rPr>
-              <w:t xml:space="preserve">0.17–0.24</w:t>
-            </w:r>
-          </w:p>
-        </w:tc>
-        <w:tc>
-          <w:tcPr>
-            <w:tcBorders>
-              <w:bottom w:val="none" w:sz="0" w:space="0" w:color="000000"/>
-              <w:top w:val="none" w:sz="0" w:space="0" w:color="000000"/>
-              <w:left w:val="none" w:sz="0" w:space="0" w:color="000000"/>
-              <w:right w:val="none" w:sz="0" w:space="0" w:color="000000"/>
-            </w:tcBorders>
-            <w:shd w:val="clear" w:color="auto" w:fill="FFFFFF"/>
-            <w:tcMar>
-              <w:top w:w="0" w:type="dxa"/>
-              <w:bottom w:w="0" w:type="dxa"/>
-              <w:left w:w="0" w:type="dxa"/>
-              <w:right w:w="0" w:type="dxa"/>
-            </w:tcMar>
-            <w:vAlign w:val="center"/>
-          </w:tcPr>
-          <w:p>
-            <w:pPr>
-              <w:pStyle w:val="Normal"/>
-              <w:jc w:val="center"/>
-              <w:pBdr>
-                <w:bottom w:val="none" w:sz="0" w:space="0" w:color="000000"/>
-                <w:top w:val="none" w:sz="0" w:space="0" w:color="000000"/>
-                <w:left w:val="none" w:sz="0" w:space="0" w:color="000000"/>
-                <w:right w:val="none" w:sz="0" w:space="0" w:color="000000"/>
-              </w:pBdr>
-              <w:spacing w:after="100" w:before="100" w:line="240"/>
-              <w:ind w:left="100" w:right="100" w:firstLine="0" w:firstLineChars="0"/>
-              <w:rPr>
-                <w:rFonts w:ascii="Arial" w:hAnsi="Arial" w:eastAsia="Arial" w:cs="Arial"/>
-                <w:i w:val="false"/>
-                <w:b w:val="false"/>
-                <w:u w:val="none"/>
-                <w:strike w:val="false"/>
-                <w:sz w:val="22"/>
-                <w:szCs w:val="22"/>
-                <w:color w:val="000000"/>
-              </w:rPr>
-            </w:pPr>
-            <w:r>
-              <w:rPr>
-                <w:rFonts w:ascii="Arial" w:hAnsi="Arial" w:eastAsia="Arial" w:cs="Arial"/>
-                <w:i w:val="false"/>
-                <w:b w:val="false"/>
-                <w:u w:val="none"/>
-                <w:strike w:val="false"/>
-                <w:sz w:val="22"/>
-                <w:szCs w:val="22"/>
-                <w:color w:val="000000"/>
-              </w:rPr>
-              <w:t xml:space="preserve">9.47</w:t>
-            </w:r>
-          </w:p>
-        </w:tc>
-        <w:tc>
-          <w:tcPr>
-            <w:tcBorders>
-              <w:bottom w:val="none" w:sz="0" w:space="0" w:color="000000"/>
-              <w:top w:val="none" w:sz="0" w:space="0" w:color="000000"/>
-              <w:left w:val="none" w:sz="0" w:space="0" w:color="000000"/>
-              <w:right w:val="none" w:sz="0" w:space="0" w:color="000000"/>
-            </w:tcBorders>
-            <w:shd w:val="clear" w:color="auto" w:fill="FFFFFF"/>
-            <w:tcMar>
-              <w:top w:w="0" w:type="dxa"/>
-              <w:bottom w:w="0" w:type="dxa"/>
-              <w:left w:w="0" w:type="dxa"/>
-              <w:right w:w="0" w:type="dxa"/>
-            </w:tcMar>
-            <w:vAlign w:val="center"/>
-          </w:tcPr>
-          <w:p>
-            <w:pPr>
-              <w:pStyle w:val="Normal"/>
-              <w:jc w:val="center"/>
-              <w:pBdr>
-                <w:bottom w:val="none" w:sz="0" w:space="0" w:color="000000"/>
-                <w:top w:val="none" w:sz="0" w:space="0" w:color="000000"/>
-                <w:left w:val="none" w:sz="0" w:space="0" w:color="000000"/>
-                <w:right w:val="none" w:sz="0" w:space="0" w:color="000000"/>
-              </w:pBdr>
-              <w:spacing w:after="100" w:before="100" w:line="240"/>
-              <w:ind w:left="100" w:right="100" w:firstLine="0" w:firstLineChars="0"/>
-              <w:rPr>
-                <w:rFonts w:ascii="Arial" w:hAnsi="Arial" w:eastAsia="Arial" w:cs="Arial"/>
-                <w:i w:val="false"/>
-                <w:b w:val="false"/>
-                <w:u w:val="none"/>
-                <w:strike w:val="false"/>
-                <w:sz w:val="22"/>
-                <w:szCs w:val="22"/>
-                <w:color w:val="000000"/>
-              </w:rPr>
-            </w:pPr>
-            <w:r>
-              <w:rPr>
-                <w:rFonts w:ascii="Arial" w:hAnsi="Arial" w:eastAsia="Arial" w:cs="Arial"/>
-                <w:i w:val="false"/>
-                <w:b w:val="false"/>
-                <w:u w:val="none"/>
-                <w:strike w:val="false"/>
-                <w:sz w:val="22"/>
-                <w:szCs w:val="22"/>
-                <w:color w:val="000000"/>
-              </w:rPr>
-              <w:t xml:space="preserve">7.80</w:t>
-            </w:r>
-          </w:p>
-        </w:tc>
-      </w:tr>
-      <w:tr>
-        <w:trPr>
-          <w:trHeight w:val="617" w:hRule="auto"/>
-        </w:trPr>
-        <w:tc>
-          <w:tcPr>
-            <w:tcBorders>
-              <w:bottom w:val="none" w:sz="0" w:space="0" w:color="000000"/>
-              <w:top w:val="none" w:sz="0" w:space="0" w:color="000000"/>
-              <w:left w:val="none" w:sz="0" w:space="0" w:color="000000"/>
-              <w:right w:val="none" w:sz="0" w:space="0" w:color="000000"/>
-            </w:tcBorders>
-            <w:shd w:val="clear" w:color="auto" w:fill="FFFFFF"/>
-            <w:tcMar>
-              <w:top w:w="0" w:type="dxa"/>
-              <w:bottom w:w="0" w:type="dxa"/>
-              <w:left w:w="0" w:type="dxa"/>
-              <w:right w:w="0" w:type="dxa"/>
-            </w:tcMar>
-            <w:vAlign w:val="center"/>
-          </w:tcPr>
-          <w:p>
-            <w:pPr>
-              <w:pStyle w:val="Normal"/>
-              <w:jc w:val="left"/>
-              <w:pBdr>
-                <w:bottom w:val="none" w:sz="0" w:space="0" w:color="000000"/>
-                <w:top w:val="none" w:sz="0" w:space="0" w:color="000000"/>
-                <w:left w:val="none" w:sz="0" w:space="0" w:color="000000"/>
-                <w:right w:val="none" w:sz="0" w:space="0" w:color="000000"/>
-              </w:pBdr>
-              <w:spacing w:after="100" w:before="100" w:line="240"/>
-              <w:ind w:left="100" w:right="100" w:firstLine="0" w:firstLineChars="0"/>
-              <w:rPr>
-                <w:rFonts w:ascii="Arial" w:hAnsi="Arial" w:eastAsia="Arial" w:cs="Arial"/>
-                <w:i w:val="false"/>
-                <w:b w:val="false"/>
-                <w:u w:val="none"/>
-                <w:strike w:val="false"/>
-                <w:sz w:val="22"/>
-                <w:szCs w:val="22"/>
-                <w:color w:val="000000"/>
-              </w:rPr>
-            </w:pPr>
-            <w:r>
-              <w:rPr>
-                <w:rFonts w:ascii="Arial" w:hAnsi="Arial" w:eastAsia="Arial" w:cs="Arial"/>
-                <w:i w:val="false"/>
-                <w:b w:val="false"/>
-                <w:u w:val="none"/>
-                <w:strike w:val="false"/>
-                <w:sz w:val="22"/>
-                <w:szCs w:val="22"/>
-                <w:color w:val="000000"/>
-              </w:rPr>
               <w:t xml:space="preserve">GU90adj</w:t>
             </w:r>
           </w:p>
@@ -3660,846 +3100,6 @@
                 <w:color w:val="000000"/>
               </w:rPr>
               <w:t xml:space="preserve">3.79</w:t>
-            </w:r>
-          </w:p>
-        </w:tc>
-      </w:tr>
-      <w:tr>
-        <w:trPr>
-          <w:trHeight w:val="617" w:hRule="auto"/>
-        </w:trPr>
-        <w:tc>
-          <w:tcPr>
-            <w:tcBorders>
-              <w:bottom w:val="none" w:sz="0" w:space="0" w:color="000000"/>
-              <w:top w:val="none" w:sz="0" w:space="0" w:color="000000"/>
-              <w:left w:val="none" w:sz="0" w:space="0" w:color="000000"/>
-              <w:right w:val="none" w:sz="0" w:space="0" w:color="000000"/>
-            </w:tcBorders>
-            <w:shd w:val="clear" w:color="auto" w:fill="FFFFFF"/>
-            <w:tcMar>
-              <w:top w:w="0" w:type="dxa"/>
-              <w:bottom w:w="0" w:type="dxa"/>
-              <w:left w:w="0" w:type="dxa"/>
-              <w:right w:w="0" w:type="dxa"/>
-            </w:tcMar>
-            <w:vAlign w:val="center"/>
-          </w:tcPr>
-          <w:p>
-            <w:pPr>
-              <w:pStyle w:val="Normal"/>
-              <w:jc w:val="left"/>
-              <w:pBdr>
-                <w:bottom w:val="none" w:sz="0" w:space="0" w:color="000000"/>
-                <w:top w:val="none" w:sz="0" w:space="0" w:color="000000"/>
-                <w:left w:val="none" w:sz="0" w:space="0" w:color="000000"/>
-                <w:right w:val="none" w:sz="0" w:space="0" w:color="000000"/>
-              </w:pBdr>
-              <w:spacing w:after="100" w:before="100" w:line="240"/>
-              <w:ind w:left="100" w:right="100" w:firstLine="0" w:firstLineChars="0"/>
-              <w:rPr>
-                <w:rFonts w:ascii="Arial" w:hAnsi="Arial" w:eastAsia="Arial" w:cs="Arial"/>
-                <w:i w:val="false"/>
-                <w:b w:val="false"/>
-                <w:u w:val="none"/>
-                <w:strike w:val="false"/>
-                <w:sz w:val="22"/>
-                <w:szCs w:val="22"/>
-                <w:color w:val="000000"/>
-              </w:rPr>
-            </w:pPr>
-            <w:r>
-              <w:rPr>
-                <w:rFonts w:ascii="Arial" w:hAnsi="Arial" w:eastAsia="Arial" w:cs="Arial"/>
-                <w:i w:val="false"/>
-                <w:b w:val="false"/>
-                <w:u w:val="none"/>
-                <w:strike w:val="false"/>
-                <w:sz w:val="22"/>
-                <w:szCs w:val="22"/>
-                <w:color w:val="000000"/>
-              </w:rPr>
-              <w:t xml:space="preserve">REC011adj</w:t>
-            </w:r>
-          </w:p>
-        </w:tc>
-        <w:tc>
-          <w:tcPr>
-            <w:tcBorders>
-              <w:bottom w:val="none" w:sz="0" w:space="0" w:color="000000"/>
-              <w:top w:val="none" w:sz="0" w:space="0" w:color="000000"/>
-              <w:left w:val="none" w:sz="0" w:space="0" w:color="000000"/>
-              <w:right w:val="none" w:sz="0" w:space="0" w:color="000000"/>
-            </w:tcBorders>
-            <w:shd w:val="clear" w:color="auto" w:fill="FFFFFF"/>
-            <w:tcMar>
-              <w:top w:w="0" w:type="dxa"/>
-              <w:bottom w:w="0" w:type="dxa"/>
-              <w:left w:w="0" w:type="dxa"/>
-              <w:right w:w="0" w:type="dxa"/>
-            </w:tcMar>
-            <w:vAlign w:val="center"/>
-          </w:tcPr>
-          <w:p>
-            <w:pPr>
-              <w:pStyle w:val="Normal"/>
-              <w:jc w:val="center"/>
-              <w:pBdr>
-                <w:bottom w:val="none" w:sz="0" w:space="0" w:color="000000"/>
-                <w:top w:val="none" w:sz="0" w:space="0" w:color="000000"/>
-                <w:left w:val="none" w:sz="0" w:space="0" w:color="000000"/>
-                <w:right w:val="none" w:sz="0" w:space="0" w:color="000000"/>
-              </w:pBdr>
-              <w:spacing w:after="100" w:before="100" w:line="240"/>
-              <w:ind w:left="100" w:right="100" w:firstLine="0" w:firstLineChars="0"/>
-              <w:rPr>
-                <w:rFonts w:ascii="Arial" w:hAnsi="Arial" w:eastAsia="Arial" w:cs="Arial"/>
-                <w:i w:val="false"/>
-                <w:b w:val="false"/>
-                <w:u w:val="none"/>
-                <w:strike w:val="false"/>
-                <w:sz w:val="22"/>
-                <w:szCs w:val="22"/>
-                <w:color w:val="000000"/>
-              </w:rPr>
-            </w:pPr>
-            <w:r>
-              <w:rPr>
-                <w:rFonts w:ascii="Arial" w:hAnsi="Arial" w:eastAsia="Arial" w:cs="Arial"/>
-                <w:i w:val="false"/>
-                <w:b w:val="false"/>
-                <w:u w:val="none"/>
-                <w:strike w:val="false"/>
-                <w:sz w:val="22"/>
-                <w:szCs w:val="22"/>
-                <w:color w:val="000000"/>
-              </w:rPr>
-              <w:t xml:space="preserve">0.61</w:t>
-            </w:r>
-          </w:p>
-        </w:tc>
-        <w:tc>
-          <w:tcPr>
-            <w:tcBorders>
-              <w:bottom w:val="none" w:sz="0" w:space="0" w:color="000000"/>
-              <w:top w:val="none" w:sz="0" w:space="0" w:color="000000"/>
-              <w:left w:val="none" w:sz="0" w:space="0" w:color="000000"/>
-              <w:right w:val="none" w:sz="0" w:space="0" w:color="000000"/>
-            </w:tcBorders>
-            <w:shd w:val="clear" w:color="auto" w:fill="FFFFFF"/>
-            <w:tcMar>
-              <w:top w:w="0" w:type="dxa"/>
-              <w:bottom w:w="0" w:type="dxa"/>
-              <w:left w:w="0" w:type="dxa"/>
-              <w:right w:w="0" w:type="dxa"/>
-            </w:tcMar>
-            <w:vAlign w:val="center"/>
-          </w:tcPr>
-          <w:p>
-            <w:pPr>
-              <w:pStyle w:val="Normal"/>
-              <w:jc w:val="center"/>
-              <w:pBdr>
-                <w:bottom w:val="none" w:sz="0" w:space="0" w:color="000000"/>
-                <w:top w:val="none" w:sz="0" w:space="0" w:color="000000"/>
-                <w:left w:val="none" w:sz="0" w:space="0" w:color="000000"/>
-                <w:right w:val="none" w:sz="0" w:space="0" w:color="000000"/>
-              </w:pBdr>
-              <w:spacing w:after="100" w:before="100" w:line="240"/>
-              <w:ind w:left="100" w:right="100" w:firstLine="0" w:firstLineChars="0"/>
-              <w:rPr>
-                <w:rFonts w:ascii="Arial" w:hAnsi="Arial" w:eastAsia="Arial" w:cs="Arial"/>
-                <w:i w:val="false"/>
-                <w:b w:val="false"/>
-                <w:u w:val="none"/>
-                <w:strike w:val="false"/>
-                <w:sz w:val="22"/>
-                <w:szCs w:val="22"/>
-                <w:color w:val="000000"/>
-              </w:rPr>
-            </w:pPr>
-            <w:r>
-              <w:rPr>
-                <w:rFonts w:ascii="Arial" w:hAnsi="Arial" w:eastAsia="Arial" w:cs="Arial"/>
-                <w:i w:val="false"/>
-                <w:b w:val="false"/>
-                <w:u w:val="none"/>
-                <w:strike w:val="false"/>
-                <w:sz w:val="22"/>
-                <w:szCs w:val="22"/>
-                <w:color w:val="000000"/>
-              </w:rPr>
-              <w:t xml:space="preserve">0.46–0.81</w:t>
-            </w:r>
-          </w:p>
-        </w:tc>
-        <w:tc>
-          <w:tcPr>
-            <w:tcBorders>
-              <w:bottom w:val="none" w:sz="0" w:space="0" w:color="000000"/>
-              <w:top w:val="none" w:sz="0" w:space="0" w:color="000000"/>
-              <w:left w:val="none" w:sz="0" w:space="0" w:color="000000"/>
-              <w:right w:val="none" w:sz="0" w:space="0" w:color="000000"/>
-            </w:tcBorders>
-            <w:shd w:val="clear" w:color="auto" w:fill="FFFFFF"/>
-            <w:tcMar>
-              <w:top w:w="0" w:type="dxa"/>
-              <w:bottom w:w="0" w:type="dxa"/>
-              <w:left w:w="0" w:type="dxa"/>
-              <w:right w:w="0" w:type="dxa"/>
-            </w:tcMar>
-            <w:vAlign w:val="center"/>
-          </w:tcPr>
-          <w:p>
-            <w:pPr>
-              <w:pStyle w:val="Normal"/>
-              <w:jc w:val="center"/>
-              <w:pBdr>
-                <w:bottom w:val="none" w:sz="0" w:space="0" w:color="000000"/>
-                <w:top w:val="none" w:sz="0" w:space="0" w:color="000000"/>
-                <w:left w:val="none" w:sz="0" w:space="0" w:color="000000"/>
-                <w:right w:val="none" w:sz="0" w:space="0" w:color="000000"/>
-              </w:pBdr>
-              <w:spacing w:after="100" w:before="100" w:line="240"/>
-              <w:ind w:left="100" w:right="100" w:firstLine="0" w:firstLineChars="0"/>
-              <w:rPr>
-                <w:rFonts w:ascii="Arial" w:hAnsi="Arial" w:eastAsia="Arial" w:cs="Arial"/>
-                <w:i w:val="false"/>
-                <w:b w:val="false"/>
-                <w:u w:val="none"/>
-                <w:strike w:val="false"/>
-                <w:sz w:val="22"/>
-                <w:szCs w:val="22"/>
-                <w:color w:val="000000"/>
-              </w:rPr>
-            </w:pPr>
-            <w:r>
-              <w:rPr>
-                <w:rFonts w:ascii="Arial" w:hAnsi="Arial" w:eastAsia="Arial" w:cs="Arial"/>
-                <w:i w:val="false"/>
-                <w:b w:val="false"/>
-                <w:u w:val="none"/>
-                <w:strike w:val="false"/>
-                <w:sz w:val="22"/>
-                <w:szCs w:val="22"/>
-                <w:color w:val="000000"/>
-              </w:rPr>
-              <w:t xml:space="preserve">2.66</w:t>
-            </w:r>
-          </w:p>
-        </w:tc>
-        <w:tc>
-          <w:tcPr>
-            <w:tcBorders>
-              <w:bottom w:val="none" w:sz="0" w:space="0" w:color="000000"/>
-              <w:top w:val="none" w:sz="0" w:space="0" w:color="000000"/>
-              <w:left w:val="none" w:sz="0" w:space="0" w:color="000000"/>
-              <w:right w:val="none" w:sz="0" w:space="0" w:color="000000"/>
-            </w:tcBorders>
-            <w:shd w:val="clear" w:color="auto" w:fill="FFFFFF"/>
-            <w:tcMar>
-              <w:top w:w="0" w:type="dxa"/>
-              <w:bottom w:w="0" w:type="dxa"/>
-              <w:left w:w="0" w:type="dxa"/>
-              <w:right w:w="0" w:type="dxa"/>
-            </w:tcMar>
-            <w:vAlign w:val="center"/>
-          </w:tcPr>
-          <w:p>
-            <w:pPr>
-              <w:pStyle w:val="Normal"/>
-              <w:jc w:val="center"/>
-              <w:pBdr>
-                <w:bottom w:val="none" w:sz="0" w:space="0" w:color="000000"/>
-                <w:top w:val="none" w:sz="0" w:space="0" w:color="000000"/>
-                <w:left w:val="none" w:sz="0" w:space="0" w:color="000000"/>
-                <w:right w:val="none" w:sz="0" w:space="0" w:color="000000"/>
-              </w:pBdr>
-              <w:spacing w:after="100" w:before="100" w:line="240"/>
-              <w:ind w:left="100" w:right="100" w:firstLine="0" w:firstLineChars="0"/>
-              <w:rPr>
-                <w:rFonts w:ascii="Arial" w:hAnsi="Arial" w:eastAsia="Arial" w:cs="Arial"/>
-                <w:i w:val="false"/>
-                <w:b w:val="false"/>
-                <w:u w:val="none"/>
-                <w:strike w:val="false"/>
-                <w:sz w:val="22"/>
-                <w:szCs w:val="22"/>
-                <w:color w:val="000000"/>
-              </w:rPr>
-            </w:pPr>
-            <w:r>
-              <w:rPr>
-                <w:rFonts w:ascii="Arial" w:hAnsi="Arial" w:eastAsia="Arial" w:cs="Arial"/>
-                <w:i w:val="false"/>
-                <w:b w:val="false"/>
-                <w:u w:val="none"/>
-                <w:strike w:val="false"/>
-                <w:sz w:val="22"/>
-                <w:szCs w:val="22"/>
-                <w:color w:val="000000"/>
-              </w:rPr>
-              <w:t xml:space="preserve">1.77</w:t>
-            </w:r>
-          </w:p>
-        </w:tc>
-      </w:tr>
-      <w:tr>
-        <w:trPr>
-          <w:trHeight w:val="617" w:hRule="auto"/>
-        </w:trPr>
-        <w:tc>
-          <w:tcPr>
-            <w:tcBorders>
-              <w:bottom w:val="none" w:sz="0" w:space="0" w:color="000000"/>
-              <w:top w:val="none" w:sz="0" w:space="0" w:color="000000"/>
-              <w:left w:val="none" w:sz="0" w:space="0" w:color="000000"/>
-              <w:right w:val="none" w:sz="0" w:space="0" w:color="000000"/>
-            </w:tcBorders>
-            <w:shd w:val="clear" w:color="auto" w:fill="FFFFFF"/>
-            <w:tcMar>
-              <w:top w:w="0" w:type="dxa"/>
-              <w:bottom w:w="0" w:type="dxa"/>
-              <w:left w:w="0" w:type="dxa"/>
-              <w:right w:w="0" w:type="dxa"/>
-            </w:tcMar>
-            <w:vAlign w:val="center"/>
-          </w:tcPr>
-          <w:p>
-            <w:pPr>
-              <w:pStyle w:val="Normal"/>
-              <w:jc w:val="left"/>
-              <w:pBdr>
-                <w:bottom w:val="none" w:sz="0" w:space="0" w:color="000000"/>
-                <w:top w:val="none" w:sz="0" w:space="0" w:color="000000"/>
-                <w:left w:val="none" w:sz="0" w:space="0" w:color="000000"/>
-                <w:right w:val="none" w:sz="0" w:space="0" w:color="000000"/>
-              </w:pBdr>
-              <w:spacing w:after="100" w:before="100" w:line="240"/>
-              <w:ind w:left="100" w:right="100" w:firstLine="0" w:firstLineChars="0"/>
-              <w:rPr>
-                <w:rFonts w:ascii="Arial" w:hAnsi="Arial" w:eastAsia="Arial" w:cs="Arial"/>
-                <w:i w:val="false"/>
-                <w:b w:val="false"/>
-                <w:u w:val="none"/>
-                <w:strike w:val="false"/>
-                <w:sz w:val="22"/>
-                <w:szCs w:val="22"/>
-                <w:color w:val="000000"/>
-              </w:rPr>
-            </w:pPr>
-            <w:r>
-              <w:rPr>
-                <w:rFonts w:ascii="Arial" w:hAnsi="Arial" w:eastAsia="Arial" w:cs="Arial"/>
-                <w:i w:val="false"/>
-                <w:b w:val="false"/>
-                <w:u w:val="none"/>
-                <w:strike w:val="false"/>
-                <w:sz w:val="22"/>
-                <w:szCs w:val="22"/>
-                <w:color w:val="000000"/>
-              </w:rPr>
-              <w:t xml:space="preserve">REC011_bestadj</w:t>
-            </w:r>
-          </w:p>
-        </w:tc>
-        <w:tc>
-          <w:tcPr>
-            <w:tcBorders>
-              <w:bottom w:val="none" w:sz="0" w:space="0" w:color="000000"/>
-              <w:top w:val="none" w:sz="0" w:space="0" w:color="000000"/>
-              <w:left w:val="none" w:sz="0" w:space="0" w:color="000000"/>
-              <w:right w:val="none" w:sz="0" w:space="0" w:color="000000"/>
-            </w:tcBorders>
-            <w:shd w:val="clear" w:color="auto" w:fill="FFFFFF"/>
-            <w:tcMar>
-              <w:top w:w="0" w:type="dxa"/>
-              <w:bottom w:w="0" w:type="dxa"/>
-              <w:left w:w="0" w:type="dxa"/>
-              <w:right w:w="0" w:type="dxa"/>
-            </w:tcMar>
-            <w:vAlign w:val="center"/>
-          </w:tcPr>
-          <w:p>
-            <w:pPr>
-              <w:pStyle w:val="Normal"/>
-              <w:jc w:val="center"/>
-              <w:pBdr>
-                <w:bottom w:val="none" w:sz="0" w:space="0" w:color="000000"/>
-                <w:top w:val="none" w:sz="0" w:space="0" w:color="000000"/>
-                <w:left w:val="none" w:sz="0" w:space="0" w:color="000000"/>
-                <w:right w:val="none" w:sz="0" w:space="0" w:color="000000"/>
-              </w:pBdr>
-              <w:spacing w:after="100" w:before="100" w:line="240"/>
-              <w:ind w:left="100" w:right="100" w:firstLine="0" w:firstLineChars="0"/>
-              <w:rPr>
-                <w:rFonts w:ascii="Arial" w:hAnsi="Arial" w:eastAsia="Arial" w:cs="Arial"/>
-                <w:i w:val="false"/>
-                <w:b w:val="false"/>
-                <w:u w:val="none"/>
-                <w:strike w:val="false"/>
-                <w:sz w:val="22"/>
-                <w:szCs w:val="22"/>
-                <w:color w:val="000000"/>
-              </w:rPr>
-            </w:pPr>
-            <w:r>
-              <w:rPr>
-                <w:rFonts w:ascii="Arial" w:hAnsi="Arial" w:eastAsia="Arial" w:cs="Arial"/>
-                <w:i w:val="false"/>
-                <w:b w:val="false"/>
-                <w:u w:val="none"/>
-                <w:strike w:val="false"/>
-                <w:sz w:val="22"/>
-                <w:szCs w:val="22"/>
-                <w:color w:val="000000"/>
-              </w:rPr>
-              <w:t xml:space="preserve">0.55</w:t>
-            </w:r>
-          </w:p>
-        </w:tc>
-        <w:tc>
-          <w:tcPr>
-            <w:tcBorders>
-              <w:bottom w:val="none" w:sz="0" w:space="0" w:color="000000"/>
-              <w:top w:val="none" w:sz="0" w:space="0" w:color="000000"/>
-              <w:left w:val="none" w:sz="0" w:space="0" w:color="000000"/>
-              <w:right w:val="none" w:sz="0" w:space="0" w:color="000000"/>
-            </w:tcBorders>
-            <w:shd w:val="clear" w:color="auto" w:fill="FFFFFF"/>
-            <w:tcMar>
-              <w:top w:w="0" w:type="dxa"/>
-              <w:bottom w:w="0" w:type="dxa"/>
-              <w:left w:w="0" w:type="dxa"/>
-              <w:right w:w="0" w:type="dxa"/>
-            </w:tcMar>
-            <w:vAlign w:val="center"/>
-          </w:tcPr>
-          <w:p>
-            <w:pPr>
-              <w:pStyle w:val="Normal"/>
-              <w:jc w:val="center"/>
-              <w:pBdr>
-                <w:bottom w:val="none" w:sz="0" w:space="0" w:color="000000"/>
-                <w:top w:val="none" w:sz="0" w:space="0" w:color="000000"/>
-                <w:left w:val="none" w:sz="0" w:space="0" w:color="000000"/>
-                <w:right w:val="none" w:sz="0" w:space="0" w:color="000000"/>
-              </w:pBdr>
-              <w:spacing w:after="100" w:before="100" w:line="240"/>
-              <w:ind w:left="100" w:right="100" w:firstLine="0" w:firstLineChars="0"/>
-              <w:rPr>
-                <w:rFonts w:ascii="Arial" w:hAnsi="Arial" w:eastAsia="Arial" w:cs="Arial"/>
-                <w:i w:val="false"/>
-                <w:b w:val="false"/>
-                <w:u w:val="none"/>
-                <w:strike w:val="false"/>
-                <w:sz w:val="22"/>
-                <w:szCs w:val="22"/>
-                <w:color w:val="000000"/>
-              </w:rPr>
-            </w:pPr>
-            <w:r>
-              <w:rPr>
-                <w:rFonts w:ascii="Arial" w:hAnsi="Arial" w:eastAsia="Arial" w:cs="Arial"/>
-                <w:i w:val="false"/>
-                <w:b w:val="false"/>
-                <w:u w:val="none"/>
-                <w:strike w:val="false"/>
-                <w:sz w:val="22"/>
-                <w:szCs w:val="22"/>
-                <w:color w:val="000000"/>
-              </w:rPr>
-              <w:t xml:space="preserve">0.45–0.69</w:t>
-            </w:r>
-          </w:p>
-        </w:tc>
-        <w:tc>
-          <w:tcPr>
-            <w:tcBorders>
-              <w:bottom w:val="none" w:sz="0" w:space="0" w:color="000000"/>
-              <w:top w:val="none" w:sz="0" w:space="0" w:color="000000"/>
-              <w:left w:val="none" w:sz="0" w:space="0" w:color="000000"/>
-              <w:right w:val="none" w:sz="0" w:space="0" w:color="000000"/>
-            </w:tcBorders>
-            <w:shd w:val="clear" w:color="auto" w:fill="FFFFFF"/>
-            <w:tcMar>
-              <w:top w:w="0" w:type="dxa"/>
-              <w:bottom w:w="0" w:type="dxa"/>
-              <w:left w:w="0" w:type="dxa"/>
-              <w:right w:w="0" w:type="dxa"/>
-            </w:tcMar>
-            <w:vAlign w:val="center"/>
-          </w:tcPr>
-          <w:p>
-            <w:pPr>
-              <w:pStyle w:val="Normal"/>
-              <w:jc w:val="center"/>
-              <w:pBdr>
-                <w:bottom w:val="none" w:sz="0" w:space="0" w:color="000000"/>
-                <w:top w:val="none" w:sz="0" w:space="0" w:color="000000"/>
-                <w:left w:val="none" w:sz="0" w:space="0" w:color="000000"/>
-                <w:right w:val="none" w:sz="0" w:space="0" w:color="000000"/>
-              </w:pBdr>
-              <w:spacing w:after="100" w:before="100" w:line="240"/>
-              <w:ind w:left="100" w:right="100" w:firstLine="0" w:firstLineChars="0"/>
-              <w:rPr>
-                <w:rFonts w:ascii="Arial" w:hAnsi="Arial" w:eastAsia="Arial" w:cs="Arial"/>
-                <w:i w:val="false"/>
-                <w:b w:val="false"/>
-                <w:u w:val="none"/>
-                <w:strike w:val="false"/>
-                <w:sz w:val="22"/>
-                <w:szCs w:val="22"/>
-                <w:color w:val="000000"/>
-              </w:rPr>
-            </w:pPr>
-            <w:r>
-              <w:rPr>
-                <w:rFonts w:ascii="Arial" w:hAnsi="Arial" w:eastAsia="Arial" w:cs="Arial"/>
-                <w:i w:val="false"/>
-                <w:b w:val="false"/>
-                <w:u w:val="none"/>
-                <w:strike w:val="false"/>
-                <w:sz w:val="22"/>
-                <w:szCs w:val="22"/>
-                <w:color w:val="000000"/>
-              </w:rPr>
-              <w:t xml:space="preserve">3.04</w:t>
-            </w:r>
-          </w:p>
-        </w:tc>
-        <w:tc>
-          <w:tcPr>
-            <w:tcBorders>
-              <w:bottom w:val="none" w:sz="0" w:space="0" w:color="000000"/>
-              <w:top w:val="none" w:sz="0" w:space="0" w:color="000000"/>
-              <w:left w:val="none" w:sz="0" w:space="0" w:color="000000"/>
-              <w:right w:val="none" w:sz="0" w:space="0" w:color="000000"/>
-            </w:tcBorders>
-            <w:shd w:val="clear" w:color="auto" w:fill="FFFFFF"/>
-            <w:tcMar>
-              <w:top w:w="0" w:type="dxa"/>
-              <w:bottom w:w="0" w:type="dxa"/>
-              <w:left w:w="0" w:type="dxa"/>
-              <w:right w:w="0" w:type="dxa"/>
-            </w:tcMar>
-            <w:vAlign w:val="center"/>
-          </w:tcPr>
-          <w:p>
-            <w:pPr>
-              <w:pStyle w:val="Normal"/>
-              <w:jc w:val="center"/>
-              <w:pBdr>
-                <w:bottom w:val="none" w:sz="0" w:space="0" w:color="000000"/>
-                <w:top w:val="none" w:sz="0" w:space="0" w:color="000000"/>
-                <w:left w:val="none" w:sz="0" w:space="0" w:color="000000"/>
-                <w:right w:val="none" w:sz="0" w:space="0" w:color="000000"/>
-              </w:pBdr>
-              <w:spacing w:after="100" w:before="100" w:line="240"/>
-              <w:ind w:left="100" w:right="100" w:firstLine="0" w:firstLineChars="0"/>
-              <w:rPr>
-                <w:rFonts w:ascii="Arial" w:hAnsi="Arial" w:eastAsia="Arial" w:cs="Arial"/>
-                <w:i w:val="false"/>
-                <w:b w:val="false"/>
-                <w:u w:val="none"/>
-                <w:strike w:val="false"/>
-                <w:sz w:val="22"/>
-                <w:szCs w:val="22"/>
-                <w:color w:val="000000"/>
-              </w:rPr>
-            </w:pPr>
-            <w:r>
-              <w:rPr>
-                <w:rFonts w:ascii="Arial" w:hAnsi="Arial" w:eastAsia="Arial" w:cs="Arial"/>
-                <w:i w:val="false"/>
-                <w:b w:val="false"/>
-                <w:u w:val="none"/>
-                <w:strike w:val="false"/>
-                <w:sz w:val="22"/>
-                <w:szCs w:val="22"/>
-                <w:color w:val="000000"/>
-              </w:rPr>
-              <w:t xml:space="preserve">2.26</w:t>
-            </w:r>
-          </w:p>
-        </w:tc>
-      </w:tr>
-      <w:tr>
-        <w:trPr>
-          <w:trHeight w:val="617" w:hRule="auto"/>
-        </w:trPr>
-        <w:tc>
-          <w:tcPr>
-            <w:tcBorders>
-              <w:bottom w:val="none" w:sz="0" w:space="0" w:color="000000"/>
-              <w:top w:val="none" w:sz="0" w:space="0" w:color="000000"/>
-              <w:left w:val="none" w:sz="0" w:space="0" w:color="000000"/>
-              <w:right w:val="none" w:sz="0" w:space="0" w:color="000000"/>
-            </w:tcBorders>
-            <w:shd w:val="clear" w:color="auto" w:fill="FFFFFF"/>
-            <w:tcMar>
-              <w:top w:w="0" w:type="dxa"/>
-              <w:bottom w:w="0" w:type="dxa"/>
-              <w:left w:w="0" w:type="dxa"/>
-              <w:right w:w="0" w:type="dxa"/>
-            </w:tcMar>
-            <w:vAlign w:val="center"/>
-          </w:tcPr>
-          <w:p>
-            <w:pPr>
-              <w:pStyle w:val="Normal"/>
-              <w:jc w:val="left"/>
-              <w:pBdr>
-                <w:bottom w:val="none" w:sz="0" w:space="0" w:color="000000"/>
-                <w:top w:val="none" w:sz="0" w:space="0" w:color="000000"/>
-                <w:left w:val="none" w:sz="0" w:space="0" w:color="000000"/>
-                <w:right w:val="none" w:sz="0" w:space="0" w:color="000000"/>
-              </w:pBdr>
-              <w:spacing w:after="100" w:before="100" w:line="240"/>
-              <w:ind w:left="100" w:right="100" w:firstLine="0" w:firstLineChars="0"/>
-              <w:rPr>
-                <w:rFonts w:ascii="Arial" w:hAnsi="Arial" w:eastAsia="Arial" w:cs="Arial"/>
-                <w:i w:val="false"/>
-                <w:b w:val="false"/>
-                <w:u w:val="none"/>
-                <w:strike w:val="false"/>
-                <w:sz w:val="22"/>
-                <w:szCs w:val="22"/>
-                <w:color w:val="000000"/>
-              </w:rPr>
-            </w:pPr>
-            <w:r>
-              <w:rPr>
-                <w:rFonts w:ascii="Arial" w:hAnsi="Arial" w:eastAsia="Arial" w:cs="Arial"/>
-                <w:i w:val="false"/>
-                <w:b w:val="false"/>
-                <w:u w:val="none"/>
-                <w:strike w:val="false"/>
-                <w:sz w:val="22"/>
-                <w:szCs w:val="22"/>
-                <w:color w:val="000000"/>
-              </w:rPr>
-              <w:t xml:space="preserve">REC011_worstadj</w:t>
-            </w:r>
-          </w:p>
-        </w:tc>
-        <w:tc>
-          <w:tcPr>
-            <w:tcBorders>
-              <w:bottom w:val="none" w:sz="0" w:space="0" w:color="000000"/>
-              <w:top w:val="none" w:sz="0" w:space="0" w:color="000000"/>
-              <w:left w:val="none" w:sz="0" w:space="0" w:color="000000"/>
-              <w:right w:val="none" w:sz="0" w:space="0" w:color="000000"/>
-            </w:tcBorders>
-            <w:shd w:val="clear" w:color="auto" w:fill="FFFFFF"/>
-            <w:tcMar>
-              <w:top w:w="0" w:type="dxa"/>
-              <w:bottom w:w="0" w:type="dxa"/>
-              <w:left w:w="0" w:type="dxa"/>
-              <w:right w:w="0" w:type="dxa"/>
-            </w:tcMar>
-            <w:vAlign w:val="center"/>
-          </w:tcPr>
-          <w:p>
-            <w:pPr>
-              <w:pStyle w:val="Normal"/>
-              <w:jc w:val="center"/>
-              <w:pBdr>
-                <w:bottom w:val="none" w:sz="0" w:space="0" w:color="000000"/>
-                <w:top w:val="none" w:sz="0" w:space="0" w:color="000000"/>
-                <w:left w:val="none" w:sz="0" w:space="0" w:color="000000"/>
-                <w:right w:val="none" w:sz="0" w:space="0" w:color="000000"/>
-              </w:pBdr>
-              <w:spacing w:after="100" w:before="100" w:line="240"/>
-              <w:ind w:left="100" w:right="100" w:firstLine="0" w:firstLineChars="0"/>
-              <w:rPr>
-                <w:rFonts w:ascii="Arial" w:hAnsi="Arial" w:eastAsia="Arial" w:cs="Arial"/>
-                <w:i w:val="false"/>
-                <w:b w:val="false"/>
-                <w:u w:val="none"/>
-                <w:strike w:val="false"/>
-                <w:sz w:val="22"/>
-                <w:szCs w:val="22"/>
-                <w:color w:val="000000"/>
-              </w:rPr>
-            </w:pPr>
-            <w:r>
-              <w:rPr>
-                <w:rFonts w:ascii="Arial" w:hAnsi="Arial" w:eastAsia="Arial" w:cs="Arial"/>
-                <w:i w:val="false"/>
-                <w:b w:val="false"/>
-                <w:u w:val="none"/>
-                <w:strike w:val="false"/>
-                <w:sz w:val="22"/>
-                <w:szCs w:val="22"/>
-                <w:color w:val="000000"/>
-              </w:rPr>
-              <w:t xml:space="preserve">1.47</w:t>
-            </w:r>
-          </w:p>
-        </w:tc>
-        <w:tc>
-          <w:tcPr>
-            <w:tcBorders>
-              <w:bottom w:val="none" w:sz="0" w:space="0" w:color="000000"/>
-              <w:top w:val="none" w:sz="0" w:space="0" w:color="000000"/>
-              <w:left w:val="none" w:sz="0" w:space="0" w:color="000000"/>
-              <w:right w:val="none" w:sz="0" w:space="0" w:color="000000"/>
-            </w:tcBorders>
-            <w:shd w:val="clear" w:color="auto" w:fill="FFFFFF"/>
-            <w:tcMar>
-              <w:top w:w="0" w:type="dxa"/>
-              <w:bottom w:w="0" w:type="dxa"/>
-              <w:left w:w="0" w:type="dxa"/>
-              <w:right w:w="0" w:type="dxa"/>
-            </w:tcMar>
-            <w:vAlign w:val="center"/>
-          </w:tcPr>
-          <w:p>
-            <w:pPr>
-              <w:pStyle w:val="Normal"/>
-              <w:jc w:val="center"/>
-              <w:pBdr>
-                <w:bottom w:val="none" w:sz="0" w:space="0" w:color="000000"/>
-                <w:top w:val="none" w:sz="0" w:space="0" w:color="000000"/>
-                <w:left w:val="none" w:sz="0" w:space="0" w:color="000000"/>
-                <w:right w:val="none" w:sz="0" w:space="0" w:color="000000"/>
-              </w:pBdr>
-              <w:spacing w:after="100" w:before="100" w:line="240"/>
-              <w:ind w:left="100" w:right="100" w:firstLine="0" w:firstLineChars="0"/>
-              <w:rPr>
-                <w:rFonts w:ascii="Arial" w:hAnsi="Arial" w:eastAsia="Arial" w:cs="Arial"/>
-                <w:i w:val="false"/>
-                <w:b w:val="false"/>
-                <w:u w:val="none"/>
-                <w:strike w:val="false"/>
-                <w:sz w:val="22"/>
-                <w:szCs w:val="22"/>
-                <w:color w:val="000000"/>
-              </w:rPr>
-            </w:pPr>
-            <w:r>
-              <w:rPr>
-                <w:rFonts w:ascii="Arial" w:hAnsi="Arial" w:eastAsia="Arial" w:cs="Arial"/>
-                <w:i w:val="false"/>
-                <w:b w:val="false"/>
-                <w:u w:val="none"/>
-                <w:strike w:val="false"/>
-                <w:sz w:val="22"/>
-                <w:szCs w:val="22"/>
-                <w:color w:val="000000"/>
-              </w:rPr>
-              <w:t xml:space="preserve">1.15–1.87</w:t>
-            </w:r>
-          </w:p>
-        </w:tc>
-        <w:tc>
-          <w:tcPr>
-            <w:tcBorders>
-              <w:bottom w:val="none" w:sz="0" w:space="0" w:color="000000"/>
-              <w:top w:val="none" w:sz="0" w:space="0" w:color="000000"/>
-              <w:left w:val="none" w:sz="0" w:space="0" w:color="000000"/>
-              <w:right w:val="none" w:sz="0" w:space="0" w:color="000000"/>
-            </w:tcBorders>
-            <w:shd w:val="clear" w:color="auto" w:fill="FFFFFF"/>
-            <w:tcMar>
-              <w:top w:w="0" w:type="dxa"/>
-              <w:bottom w:w="0" w:type="dxa"/>
-              <w:left w:w="0" w:type="dxa"/>
-              <w:right w:w="0" w:type="dxa"/>
-            </w:tcMar>
-            <w:vAlign w:val="center"/>
-          </w:tcPr>
-          <w:p>
-            <w:pPr>
-              <w:pStyle w:val="Normal"/>
-              <w:jc w:val="center"/>
-              <w:pBdr>
-                <w:bottom w:val="none" w:sz="0" w:space="0" w:color="000000"/>
-                <w:top w:val="none" w:sz="0" w:space="0" w:color="000000"/>
-                <w:left w:val="none" w:sz="0" w:space="0" w:color="000000"/>
-                <w:right w:val="none" w:sz="0" w:space="0" w:color="000000"/>
-              </w:pBdr>
-              <w:spacing w:after="100" w:before="100" w:line="240"/>
-              <w:ind w:left="100" w:right="100" w:firstLine="0" w:firstLineChars="0"/>
-              <w:rPr>
-                <w:rFonts w:ascii="Arial" w:hAnsi="Arial" w:eastAsia="Arial" w:cs="Arial"/>
-                <w:i w:val="false"/>
-                <w:b w:val="false"/>
-                <w:u w:val="none"/>
-                <w:strike w:val="false"/>
-                <w:sz w:val="22"/>
-                <w:szCs w:val="22"/>
-                <w:color w:val="000000"/>
-              </w:rPr>
-            </w:pPr>
-            <w:r>
-              <w:rPr>
-                <w:rFonts w:ascii="Arial" w:hAnsi="Arial" w:eastAsia="Arial" w:cs="Arial"/>
-                <w:i w:val="false"/>
-                <w:b w:val="false"/>
-                <w:u w:val="none"/>
-                <w:strike w:val="false"/>
-                <w:sz w:val="22"/>
-                <w:szCs w:val="22"/>
-                <w:color w:val="000000"/>
-              </w:rPr>
-              <w:t xml:space="preserve">1.72</w:t>
-            </w:r>
-          </w:p>
-        </w:tc>
-        <w:tc>
-          <w:tcPr>
-            <w:tcBorders>
-              <w:bottom w:val="none" w:sz="0" w:space="0" w:color="000000"/>
-              <w:top w:val="none" w:sz="0" w:space="0" w:color="000000"/>
-              <w:left w:val="none" w:sz="0" w:space="0" w:color="000000"/>
-              <w:right w:val="none" w:sz="0" w:space="0" w:color="000000"/>
-            </w:tcBorders>
-            <w:shd w:val="clear" w:color="auto" w:fill="FFFFFF"/>
-            <w:tcMar>
-              <w:top w:w="0" w:type="dxa"/>
-              <w:bottom w:w="0" w:type="dxa"/>
-              <w:left w:w="0" w:type="dxa"/>
-              <w:right w:w="0" w:type="dxa"/>
-            </w:tcMar>
-            <w:vAlign w:val="center"/>
-          </w:tcPr>
-          <w:p>
-            <w:pPr>
-              <w:pStyle w:val="Normal"/>
-              <w:jc w:val="center"/>
-              <w:pBdr>
-                <w:bottom w:val="none" w:sz="0" w:space="0" w:color="000000"/>
-                <w:top w:val="none" w:sz="0" w:space="0" w:color="000000"/>
-                <w:left w:val="none" w:sz="0" w:space="0" w:color="000000"/>
-                <w:right w:val="none" w:sz="0" w:space="0" w:color="000000"/>
-              </w:pBdr>
-              <w:spacing w:after="100" w:before="100" w:line="240"/>
-              <w:ind w:left="100" w:right="100" w:firstLine="0" w:firstLineChars="0"/>
-              <w:rPr>
-                <w:rFonts w:ascii="Arial" w:hAnsi="Arial" w:eastAsia="Arial" w:cs="Arial"/>
-                <w:i w:val="false"/>
-                <w:b w:val="false"/>
-                <w:u w:val="none"/>
-                <w:strike w:val="false"/>
-                <w:sz w:val="22"/>
-                <w:szCs w:val="22"/>
-                <w:color w:val="000000"/>
-              </w:rPr>
-            </w:pPr>
-            <w:r>
-              <w:rPr>
-                <w:rFonts w:ascii="Arial" w:hAnsi="Arial" w:eastAsia="Arial" w:cs="Arial"/>
-                <w:i w:val="false"/>
-                <w:b w:val="false"/>
-                <w:u w:val="none"/>
-                <w:strike w:val="false"/>
-                <w:sz w:val="22"/>
-                <w:szCs w:val="22"/>
-                <w:color w:val="000000"/>
-              </w:rPr>
-              <w:t xml:space="preserve">1.35</w:t>
             </w:r>
           </w:p>
         </w:tc>

</xml_diff>